<commit_message>
feat: implement Excel import functionality for Word generation; add new import script and integrate into app
</commit_message>
<xml_diff>
--- a/FormatoWordUAS.docx
+++ b/FormatoWordUAS.docx
@@ -29,7 +29,7 @@
           </w:tcPr>
           <w:p>
             <w:pPr>
-              <w:pStyle w:val="856"/>
+              <w:pStyle w:val="858"/>
               <w:pBdr/>
               <w:spacing w:after="0" w:before="0" w:line="240" w:lineRule="auto"/>
               <w:ind/>
@@ -81,7 +81,7 @@
           </w:tcPr>
           <w:p>
             <w:pPr>
-              <w:pStyle w:val="856"/>
+              <w:pStyle w:val="858"/>
               <w:pBdr/>
               <w:spacing w:after="0" w:before="0" w:line="240" w:lineRule="auto"/>
               <w:ind/>
@@ -143,7 +143,7 @@
           </w:tcPr>
           <w:p>
             <w:pPr>
-              <w:pStyle w:val="856"/>
+              <w:pStyle w:val="858"/>
               <w:pBdr/>
               <w:spacing w:after="0" w:before="0" w:line="240" w:lineRule="auto"/>
               <w:ind/>
@@ -189,7 +189,7 @@
     </w:tbl>
     <w:p>
       <w:pPr>
-        <w:pStyle w:val="832"/>
+        <w:pStyle w:val="834"/>
         <w:pBdr/>
         <w:spacing/>
         <w:ind/>
@@ -235,7 +235,7 @@
     </w:p>
     <w:p>
       <w:pPr>
-        <w:pStyle w:val="832"/>
+        <w:pStyle w:val="834"/>
         <w:pBdr/>
         <w:spacing/>
         <w:ind/>
@@ -276,18 +276,16 @@
     </w:p>
     <w:p>
       <w:pPr>
-        <w:pStyle w:val="856"/>
-        <w:pBdr/>
-        <w:bidi w:val="false"/>
-        <w:spacing w:line="360" w:lineRule="auto"/>
-        <w:ind w:firstLine="0" w:left="142"/>
+        <w:pBdr>
+          <w:top w:val="none" w:color="000000" w:sz="4" w:space="0"/>
+          <w:left w:val="none" w:color="000000" w:sz="4" w:space="0"/>
+          <w:bottom w:val="none" w:color="000000" w:sz="4" w:space="0"/>
+          <w:right w:val="none" w:color="000000" w:sz="4" w:space="0"/>
+        </w:pBdr>
+        <w:spacing w:after="200" w:before="0" w:line="432" w:lineRule="auto"/>
+        <w:ind w:right="0" w:firstLine="0" w:left="142"/>
         <w:jc w:val="both"/>
-        <w:rPr>
-          <w:rFonts w:ascii="Arial" w:hAnsi="Arial" w:eastAsia="Arial" w:cs="Arial"/>
-          <w:sz w:val="20"/>
-          <w:szCs w:val="20"/>
-          <w:highlight w:val="none"/>
-        </w:rPr>
+        <w:rPr/>
       </w:pPr>
       <w:r>
         <w:rPr>
@@ -339,6 +337,41 @@
           <w:sz w:val="20"/>
           <w:szCs w:val="20"/>
           <w:highlight w:val="none"/>
+          <w:lang w:val="es-ES"/>
+        </w:rPr>
+        <w:t xml:space="preserve"> </w:t>
+      </w:r>
+      <w:r>
+        <w:rPr>
+          <w:rFonts w:ascii="Arial" w:hAnsi="Arial" w:eastAsia="Arial" w:cs="Arial"/>
+          <w:sz w:val="20"/>
+          <w:szCs w:val="20"/>
+          <w:highlight w:val="none"/>
+        </w:rPr>
+      </w:r>
+      <w:r>
+        <w:rPr>
+          <w:rFonts w:ascii="Arial" w:hAnsi="Arial" w:eastAsia="Arial" w:cs="Arial"/>
+          <w:color w:val="000000"/>
+          <w:sz w:val="22"/>
+          <w:u w:val="none"/>
+        </w:rPr>
+        <w:t xml:space="preserve">Las materias que tiene asignadas son las siguientes:</w:t>
+      </w:r>
+      <w:r/>
+      <w:r>
+        <w:rPr>
+          <w:sz w:val="24"/>
+        </w:rPr>
+      </w:r>
+      <w:r/>
+      <w:r>
+        <w:rPr>
+          <w:rFonts w:ascii="Arial" w:hAnsi="Arial" w:eastAsia="Arial" w:cs="Arial"/>
+          <w:sz w:val="20"/>
+          <w:szCs w:val="20"/>
+          <w:highlight w:val="none"/>
+          <w:lang w:val="es-ES"/>
         </w:rPr>
       </w:r>
       <w:r>
@@ -347,6 +380,12 @@
           <w:sz w:val="20"/>
           <w:szCs w:val="20"/>
           <w:highlight w:val="none"/>
+        </w:rPr>
+      </w:r>
+      <w:r/>
+      <w:r>
+        <w:rPr>
+          <w:sz w:val="24"/>
         </w:rPr>
       </w:r>
     </w:p>
@@ -387,7 +426,7 @@
           </w:tcPr>
           <w:p>
             <w:pPr>
-              <w:pStyle w:val="856"/>
+              <w:pStyle w:val="858"/>
               <w:pBdr/>
               <w:spacing w:after="200" w:before="0"/>
               <w:ind/>
@@ -443,7 +482,7 @@
           </w:tcPr>
           <w:p>
             <w:pPr>
-              <w:pStyle w:val="856"/>
+              <w:pStyle w:val="858"/>
               <w:pBdr/>
               <w:spacing w:after="200" w:before="0"/>
               <w:ind/>
@@ -499,7 +538,7 @@
           </w:tcPr>
           <w:p>
             <w:pPr>
-              <w:pStyle w:val="856"/>
+              <w:pStyle w:val="858"/>
               <w:pBdr/>
               <w:spacing w:after="200" w:before="0"/>
               <w:ind/>
@@ -560,7 +599,7 @@
           </w:tcPr>
           <w:p>
             <w:pPr>
-              <w:pStyle w:val="832"/>
+              <w:pStyle w:val="834"/>
               <w:pBdr/>
               <w:spacing w:after="200" w:before="0"/>
               <w:ind/>
@@ -608,7 +647,7 @@
           </w:tcPr>
           <w:p>
             <w:pPr>
-              <w:pStyle w:val="832"/>
+              <w:pStyle w:val="834"/>
               <w:pBdr/>
               <w:spacing w:after="200" w:before="0"/>
               <w:ind/>
@@ -656,7 +695,7 @@
           </w:tcPr>
           <w:p>
             <w:pPr>
-              <w:pStyle w:val="856"/>
+              <w:pStyle w:val="858"/>
               <w:pBdr/>
               <w:spacing w:after="200" w:before="0"/>
               <w:ind/>
@@ -695,7 +734,7 @@
     </w:tbl>
     <w:p>
       <w:pPr>
-        <w:pStyle w:val="856"/>
+        <w:pStyle w:val="858"/>
         <w:pBdr/>
         <w:spacing/>
         <w:ind/>
@@ -722,7 +761,7 @@
     </w:p>
     <w:p>
       <w:pPr>
-        <w:pStyle w:val="856"/>
+        <w:pStyle w:val="858"/>
         <w:pBdr/>
         <w:spacing w:line="360" w:lineRule="auto"/>
         <w:ind w:firstLine="0" w:left="142"/>
@@ -776,7 +815,7 @@
     </w:p>
     <w:p>
       <w:pPr>
-        <w:pStyle w:val="856"/>
+        <w:pStyle w:val="858"/>
         <w:pBdr/>
         <w:spacing/>
         <w:ind w:firstLine="708"/>
@@ -812,7 +851,7 @@
     </w:p>
     <w:p>
       <w:pPr>
-        <w:pStyle w:val="856"/>
+        <w:pStyle w:val="858"/>
         <w:pBdr/>
         <w:spacing w:after="0" w:before="0" w:line="240" w:lineRule="auto"/>
         <w:ind/>
@@ -839,7 +878,7 @@
     </w:p>
     <w:p>
       <w:pPr>
-        <w:pStyle w:val="856"/>
+        <w:pStyle w:val="858"/>
         <w:pBdr/>
         <w:spacing w:after="0" w:before="0" w:line="240" w:lineRule="auto"/>
         <w:ind/>
@@ -875,7 +914,7 @@
     </w:p>
     <w:p>
       <w:pPr>
-        <w:pStyle w:val="856"/>
+        <w:pStyle w:val="858"/>
         <w:pBdr/>
         <w:spacing w:after="0" w:before="0" w:line="240" w:lineRule="auto"/>
         <w:ind/>
@@ -939,7 +978,7 @@
     </w:p>
     <w:p>
       <w:pPr>
-        <w:pStyle w:val="856"/>
+        <w:pStyle w:val="858"/>
         <w:pBdr/>
         <w:spacing w:after="0" w:before="0" w:line="240" w:lineRule="auto"/>
         <w:ind/>
@@ -990,7 +1029,7 @@
     </w:p>
     <w:p>
       <w:pPr>
-        <w:pStyle w:val="856"/>
+        <w:pStyle w:val="858"/>
         <w:pBdr/>
         <w:spacing w:after="0" w:before="0" w:line="240" w:lineRule="auto"/>
         <w:ind/>
@@ -1041,7 +1080,7 @@
     </w:p>
     <w:p>
       <w:pPr>
-        <w:pStyle w:val="856"/>
+        <w:pStyle w:val="858"/>
         <w:pBdr/>
         <w:spacing w:after="0" w:before="0" w:line="240" w:lineRule="auto"/>
         <w:ind/>
@@ -1092,7 +1131,7 @@
     </w:p>
     <w:p>
       <w:pPr>
-        <w:pStyle w:val="856"/>
+        <w:pStyle w:val="858"/>
         <w:pBdr/>
         <w:spacing w:after="0" w:before="0" w:line="240" w:lineRule="auto"/>
         <w:ind/>
@@ -1143,7 +1182,7 @@
     </w:p>
     <w:p>
       <w:pPr>
-        <w:pStyle w:val="856"/>
+        <w:pStyle w:val="858"/>
         <w:pBdr/>
         <w:spacing w:after="0" w:before="0" w:line="240" w:lineRule="auto"/>
         <w:ind/>
@@ -1196,7 +1235,7 @@
     </w:p>
     <w:p>
       <w:pPr>
-        <w:pStyle w:val="856"/>
+        <w:pStyle w:val="858"/>
         <w:pBdr/>
         <w:spacing w:after="0" w:before="0" w:line="240" w:lineRule="auto"/>
         <w:ind/>
@@ -1294,7 +1333,7 @@
 <w:ftr xmlns:wpc="http://schemas.microsoft.com/office/word/2010/wordprocessingCanvas" xmlns:mc="http://schemas.openxmlformats.org/markup-compatibility/2006" xmlns:o="urn:schemas-microsoft-com:office:office" xmlns:r="http://schemas.openxmlformats.org/officeDocument/2006/relationships" xmlns:m="http://schemas.openxmlformats.org/officeDocument/2006/math" xmlns:v="urn:schemas-microsoft-com:vml" xmlns:wp14="http://schemas.microsoft.com/office/word/2010/wordprocessingDrawing" xmlns:wp="http://schemas.openxmlformats.org/drawingml/2006/wordprocessingDrawing" xmlns:w10="urn:schemas-microsoft-com:office:word" xmlns:w="http://schemas.openxmlformats.org/wordprocessingml/2006/main" xmlns:w14="http://schemas.microsoft.com/office/word/2010/wordml" xmlns:w15="http://schemas.microsoft.com/office/word/2012/wordml" xmlns:wpg="http://schemas.microsoft.com/office/word/2010/wordprocessingGroup" xmlns:wpi="http://schemas.microsoft.com/office/word/2010/wordprocessingInk" xmlns:wne="http://schemas.microsoft.com/office/word/2006/wordml" xmlns:a="http://schemas.openxmlformats.org/drawingml/2006/main" xmlns:wps="http://schemas.microsoft.com/office/word/2010/wordprocessingShape" mc:Ignorable="w14 w15 wp14">
   <w:p>
     <w:pPr>
-      <w:pStyle w:val="841"/>
+      <w:pStyle w:val="843"/>
       <w:pBdr/>
       <w:spacing/>
       <w:ind/>
@@ -1310,7 +1349,7 @@
 <w:ftr xmlns:wpc="http://schemas.microsoft.com/office/word/2010/wordprocessingCanvas" xmlns:mc="http://schemas.openxmlformats.org/markup-compatibility/2006" xmlns:o="urn:schemas-microsoft-com:office:office" xmlns:r="http://schemas.openxmlformats.org/officeDocument/2006/relationships" xmlns:m="http://schemas.openxmlformats.org/officeDocument/2006/math" xmlns:v="urn:schemas-microsoft-com:vml" xmlns:wp14="http://schemas.microsoft.com/office/word/2010/wordprocessingDrawing" xmlns:wp="http://schemas.openxmlformats.org/drawingml/2006/wordprocessingDrawing" xmlns:w10="urn:schemas-microsoft-com:office:word" xmlns:w="http://schemas.openxmlformats.org/wordprocessingml/2006/main" xmlns:w14="http://schemas.microsoft.com/office/word/2010/wordml" xmlns:w15="http://schemas.microsoft.com/office/word/2012/wordml" xmlns:wpg="http://schemas.microsoft.com/office/word/2010/wordprocessingGroup" xmlns:wpi="http://schemas.microsoft.com/office/word/2010/wordprocessingInk" xmlns:wne="http://schemas.microsoft.com/office/word/2006/wordml" xmlns:a="http://schemas.openxmlformats.org/drawingml/2006/main" xmlns:wps="http://schemas.microsoft.com/office/word/2010/wordprocessingShape" mc:Ignorable="w14 w15 wp14">
   <w:p>
     <w:pPr>
-      <w:pStyle w:val="841"/>
+      <w:pStyle w:val="843"/>
       <w:pBdr/>
       <w:spacing/>
       <w:ind/>
@@ -1326,7 +1365,7 @@
 <w:ftr xmlns:wpc="http://schemas.microsoft.com/office/word/2010/wordprocessingCanvas" xmlns:mc="http://schemas.openxmlformats.org/markup-compatibility/2006" xmlns:o="urn:schemas-microsoft-com:office:office" xmlns:r="http://schemas.openxmlformats.org/officeDocument/2006/relationships" xmlns:m="http://schemas.openxmlformats.org/officeDocument/2006/math" xmlns:v="urn:schemas-microsoft-com:vml" xmlns:wp14="http://schemas.microsoft.com/office/word/2010/wordprocessingDrawing" xmlns:wp="http://schemas.openxmlformats.org/drawingml/2006/wordprocessingDrawing" xmlns:w10="urn:schemas-microsoft-com:office:word" xmlns:w="http://schemas.openxmlformats.org/wordprocessingml/2006/main" xmlns:w14="http://schemas.microsoft.com/office/word/2010/wordml" xmlns:w15="http://schemas.microsoft.com/office/word/2012/wordml" xmlns:wpg="http://schemas.microsoft.com/office/word/2010/wordprocessingGroup" xmlns:wpi="http://schemas.microsoft.com/office/word/2010/wordprocessingInk" xmlns:wne="http://schemas.microsoft.com/office/word/2006/wordml" xmlns:a="http://schemas.openxmlformats.org/drawingml/2006/main" xmlns:wps="http://schemas.microsoft.com/office/word/2010/wordprocessingShape" mc:Ignorable="w14 w15 wp14">
   <w:p>
     <w:pPr>
-      <w:pStyle w:val="841"/>
+      <w:pStyle w:val="843"/>
       <w:pBdr/>
       <w:spacing/>
       <w:ind/>
@@ -1375,7 +1414,7 @@
 <w:hdr xmlns:wpc="http://schemas.microsoft.com/office/word/2010/wordprocessingCanvas" xmlns:mc="http://schemas.openxmlformats.org/markup-compatibility/2006" xmlns:o="urn:schemas-microsoft-com:office:office" xmlns:r="http://schemas.openxmlformats.org/officeDocument/2006/relationships" xmlns:m="http://schemas.openxmlformats.org/officeDocument/2006/math" xmlns:v="urn:schemas-microsoft-com:vml" xmlns:wp14="http://schemas.microsoft.com/office/word/2010/wordprocessingDrawing" xmlns:wp="http://schemas.openxmlformats.org/drawingml/2006/wordprocessingDrawing" xmlns:w10="urn:schemas-microsoft-com:office:word" xmlns:w="http://schemas.openxmlformats.org/wordprocessingml/2006/main" xmlns:w14="http://schemas.microsoft.com/office/word/2010/wordml" xmlns:w15="http://schemas.microsoft.com/office/word/2012/wordml" xmlns:wpg="http://schemas.microsoft.com/office/word/2010/wordprocessingGroup" xmlns:wpi="http://schemas.microsoft.com/office/word/2010/wordprocessingInk" xmlns:wne="http://schemas.microsoft.com/office/word/2006/wordml" xmlns:a="http://schemas.openxmlformats.org/drawingml/2006/main" xmlns:wps="http://schemas.microsoft.com/office/word/2010/wordprocessingShape" mc:Ignorable="w14 w15 wp14">
   <w:p>
     <w:pPr>
-      <w:pStyle w:val="856"/>
+      <w:pStyle w:val="858"/>
       <w:keepNext w:val="false"/>
       <w:keepLines w:val="false"/>
       <w:widowControl w:val="true"/>
@@ -1574,7 +1613,7 @@
 <w:hdr xmlns:wpc="http://schemas.microsoft.com/office/word/2010/wordprocessingCanvas" xmlns:mc="http://schemas.openxmlformats.org/markup-compatibility/2006" xmlns:o="urn:schemas-microsoft-com:office:office" xmlns:r="http://schemas.openxmlformats.org/officeDocument/2006/relationships" xmlns:m="http://schemas.openxmlformats.org/officeDocument/2006/math" xmlns:v="urn:schemas-microsoft-com:vml" xmlns:wp14="http://schemas.microsoft.com/office/word/2010/wordprocessingDrawing" xmlns:wp="http://schemas.openxmlformats.org/drawingml/2006/wordprocessingDrawing" xmlns:w10="urn:schemas-microsoft-com:office:word" xmlns:w="http://schemas.openxmlformats.org/wordprocessingml/2006/main" xmlns:w14="http://schemas.microsoft.com/office/word/2010/wordml" xmlns:w15="http://schemas.microsoft.com/office/word/2012/wordml" xmlns:wpg="http://schemas.microsoft.com/office/word/2010/wordprocessingGroup" xmlns:wpi="http://schemas.microsoft.com/office/word/2010/wordprocessingInk" xmlns:wne="http://schemas.microsoft.com/office/word/2006/wordml" xmlns:a="http://schemas.openxmlformats.org/drawingml/2006/main" xmlns:wps="http://schemas.microsoft.com/office/word/2010/wordprocessingShape" mc:Ignorable="w14 w15 wp14">
   <w:p>
     <w:pPr>
-      <w:pStyle w:val="860"/>
+      <w:pStyle w:val="862"/>
       <w:pBdr/>
       <w:spacing w:after="200" w:before="0"/>
       <w:ind/>
@@ -1590,7 +1629,7 @@
 <w:hdr xmlns:wpc="http://schemas.microsoft.com/office/word/2010/wordprocessingCanvas" xmlns:mc="http://schemas.openxmlformats.org/markup-compatibility/2006" xmlns:o="urn:schemas-microsoft-com:office:office" xmlns:r="http://schemas.openxmlformats.org/officeDocument/2006/relationships" xmlns:m="http://schemas.openxmlformats.org/officeDocument/2006/math" xmlns:v="urn:schemas-microsoft-com:vml" xmlns:wp14="http://schemas.microsoft.com/office/word/2010/wordprocessingDrawing" xmlns:wp="http://schemas.openxmlformats.org/drawingml/2006/wordprocessingDrawing" xmlns:w10="urn:schemas-microsoft-com:office:word" xmlns:w="http://schemas.openxmlformats.org/wordprocessingml/2006/main" xmlns:w14="http://schemas.microsoft.com/office/word/2010/wordml" xmlns:w15="http://schemas.microsoft.com/office/word/2012/wordml" xmlns:wpg="http://schemas.microsoft.com/office/word/2010/wordprocessingGroup" xmlns:wpi="http://schemas.microsoft.com/office/word/2010/wordprocessingInk" xmlns:wne="http://schemas.microsoft.com/office/word/2006/wordml" xmlns:a="http://schemas.openxmlformats.org/drawingml/2006/main" xmlns:wps="http://schemas.microsoft.com/office/word/2010/wordprocessingShape" mc:Ignorable="w14 w15 wp14">
   <w:p>
     <w:pPr>
-      <w:pStyle w:val="856"/>
+      <w:pStyle w:val="858"/>
       <w:keepNext w:val="false"/>
       <w:keepLines w:val="false"/>
       <w:widowControl w:val="true"/>
@@ -1943,7 +1982,7 @@
     <w:lsdException w:name="Bibliography" w:uiPriority="37"/>
     <w:lsdException w:name="TOC Heading" w:uiPriority="39" w:qFormat="1"/>
   </w:latentStyles>
-  <w:style w:type="paragraph" w:styleId="789" w:default="1">
+  <w:style w:type="paragraph" w:styleId="791" w:default="1">
     <w:name w:val="Normal"/>
     <w:qFormat/>
     <w:pPr>
@@ -1962,10 +2001,10 @@
       <w:lang w:val="es-MX" w:eastAsia="zh-CN" w:bidi="hi-IN"/>
     </w:rPr>
   </w:style>
-  <w:style w:type="paragraph" w:styleId="790">
+  <w:style w:type="paragraph" w:styleId="792">
     <w:name w:val="Heading 1"/>
-    <w:basedOn w:val="856"/>
-    <w:next w:val="856"/>
+    <w:basedOn w:val="858"/>
+    <w:next w:val="858"/>
     <w:qFormat/>
     <w:pPr>
       <w:keepNext w:val="true"/>
@@ -1982,10 +2021,10 @@
       <w:szCs w:val="48"/>
     </w:rPr>
   </w:style>
-  <w:style w:type="paragraph" w:styleId="791">
+  <w:style w:type="paragraph" w:styleId="793">
     <w:name w:val="Heading 2"/>
-    <w:basedOn w:val="856"/>
-    <w:next w:val="856"/>
+    <w:basedOn w:val="858"/>
+    <w:next w:val="858"/>
     <w:qFormat/>
     <w:pPr>
       <w:keepNext w:val="true"/>
@@ -2002,10 +2041,10 @@
       <w:szCs w:val="36"/>
     </w:rPr>
   </w:style>
-  <w:style w:type="paragraph" w:styleId="792">
+  <w:style w:type="paragraph" w:styleId="794">
     <w:name w:val="Heading 3"/>
-    <w:basedOn w:val="856"/>
-    <w:next w:val="856"/>
+    <w:basedOn w:val="858"/>
+    <w:next w:val="858"/>
     <w:qFormat/>
     <w:pPr>
       <w:keepNext w:val="true"/>
@@ -2022,10 +2061,10 @@
       <w:szCs w:val="28"/>
     </w:rPr>
   </w:style>
-  <w:style w:type="paragraph" w:styleId="793">
+  <w:style w:type="paragraph" w:styleId="795">
     <w:name w:val="Heading 4"/>
-    <w:basedOn w:val="856"/>
-    <w:next w:val="856"/>
+    <w:basedOn w:val="858"/>
+    <w:next w:val="858"/>
     <w:qFormat/>
     <w:pPr>
       <w:keepNext w:val="true"/>
@@ -2042,10 +2081,10 @@
       <w:szCs w:val="24"/>
     </w:rPr>
   </w:style>
-  <w:style w:type="paragraph" w:styleId="794">
+  <w:style w:type="paragraph" w:styleId="796">
     <w:name w:val="Heading 5"/>
-    <w:basedOn w:val="856"/>
-    <w:next w:val="856"/>
+    <w:basedOn w:val="858"/>
+    <w:next w:val="858"/>
     <w:qFormat/>
     <w:pPr>
       <w:keepNext w:val="true"/>
@@ -2062,10 +2101,10 @@
       <w:szCs w:val="22"/>
     </w:rPr>
   </w:style>
-  <w:style w:type="paragraph" w:styleId="795">
+  <w:style w:type="paragraph" w:styleId="797">
     <w:name w:val="Heading 6"/>
-    <w:basedOn w:val="856"/>
-    <w:next w:val="856"/>
+    <w:basedOn w:val="858"/>
+    <w:next w:val="858"/>
     <w:qFormat/>
     <w:pPr>
       <w:keepNext w:val="true"/>
@@ -2082,11 +2121,11 @@
       <w:szCs w:val="20"/>
     </w:rPr>
   </w:style>
-  <w:style w:type="paragraph" w:styleId="796">
+  <w:style w:type="paragraph" w:styleId="798">
     <w:name w:val="Heading 7"/>
-    <w:basedOn w:val="789"/>
-    <w:next w:val="789"/>
-    <w:link w:val="806"/>
+    <w:basedOn w:val="791"/>
+    <w:next w:val="791"/>
+    <w:link w:val="808"/>
     <w:uiPriority w:val="9"/>
     <w:unhideWhenUsed/>
     <w:qFormat/>
@@ -2103,11 +2142,11 @@
       <w:color w:val="595959" w:themeColor="text1" w:themeTint="A6"/>
     </w:rPr>
   </w:style>
-  <w:style w:type="paragraph" w:styleId="797">
+  <w:style w:type="paragraph" w:styleId="799">
     <w:name w:val="Heading 8"/>
-    <w:basedOn w:val="789"/>
-    <w:next w:val="789"/>
-    <w:link w:val="807"/>
+    <w:basedOn w:val="791"/>
+    <w:next w:val="791"/>
+    <w:link w:val="809"/>
     <w:uiPriority w:val="9"/>
     <w:unhideWhenUsed/>
     <w:qFormat/>
@@ -2126,11 +2165,11 @@
       <w:color w:val="272727" w:themeColor="text1" w:themeTint="D8"/>
     </w:rPr>
   </w:style>
-  <w:style w:type="paragraph" w:styleId="798">
+  <w:style w:type="paragraph" w:styleId="800">
     <w:name w:val="Heading 9"/>
-    <w:basedOn w:val="789"/>
-    <w:next w:val="789"/>
-    <w:link w:val="808"/>
+    <w:basedOn w:val="791"/>
+    <w:next w:val="791"/>
+    <w:link w:val="810"/>
     <w:uiPriority w:val="9"/>
     <w:unhideWhenUsed/>
     <w:qFormat/>
@@ -2149,7 +2188,7 @@
       <w:color w:val="272727" w:themeColor="text1" w:themeTint="D8"/>
     </w:rPr>
   </w:style>
-  <w:style w:type="character" w:styleId="799" w:default="1">
+  <w:style w:type="character" w:styleId="801" w:default="1">
     <w:name w:val="Default Paragraph Font"/>
     <w:uiPriority w:val="1"/>
     <w:semiHidden/>
@@ -2161,10 +2200,10 @@
       <w:ind/>
     </w:pPr>
   </w:style>
-  <w:style w:type="character" w:styleId="800">
+  <w:style w:type="character" w:styleId="802">
     <w:name w:val="Heading 1 Char"/>
-    <w:basedOn w:val="799"/>
-    <w:link w:val="790"/>
+    <w:basedOn w:val="801"/>
+    <w:link w:val="792"/>
     <w:uiPriority w:val="9"/>
     <w:qFormat/>
     <w:pPr>
@@ -2179,10 +2218,10 @@
       <w:szCs w:val="40"/>
     </w:rPr>
   </w:style>
-  <w:style w:type="character" w:styleId="801">
+  <w:style w:type="character" w:styleId="803">
     <w:name w:val="Heading 2 Char"/>
-    <w:basedOn w:val="799"/>
-    <w:link w:val="791"/>
+    <w:basedOn w:val="801"/>
+    <w:link w:val="793"/>
     <w:uiPriority w:val="9"/>
     <w:qFormat/>
     <w:pPr>
@@ -2197,10 +2236,10 @@
       <w:szCs w:val="32"/>
     </w:rPr>
   </w:style>
-  <w:style w:type="character" w:styleId="802">
+  <w:style w:type="character" w:styleId="804">
     <w:name w:val="Heading 3 Char"/>
-    <w:basedOn w:val="799"/>
-    <w:link w:val="792"/>
+    <w:basedOn w:val="801"/>
+    <w:link w:val="794"/>
     <w:uiPriority w:val="9"/>
     <w:qFormat/>
     <w:pPr>
@@ -2215,10 +2254,10 @@
       <w:szCs w:val="28"/>
     </w:rPr>
   </w:style>
-  <w:style w:type="character" w:styleId="803">
+  <w:style w:type="character" w:styleId="805">
     <w:name w:val="Heading 4 Char"/>
-    <w:basedOn w:val="799"/>
-    <w:link w:val="793"/>
+    <w:basedOn w:val="801"/>
+    <w:link w:val="795"/>
     <w:uiPriority w:val="9"/>
     <w:qFormat/>
     <w:pPr>
@@ -2233,10 +2272,10 @@
       <w:color w:val="0f4761" w:themeColor="accent1" w:themeShade="BF"/>
     </w:rPr>
   </w:style>
-  <w:style w:type="character" w:styleId="804">
+  <w:style w:type="character" w:styleId="806">
     <w:name w:val="Heading 5 Char"/>
-    <w:basedOn w:val="799"/>
-    <w:link w:val="794"/>
+    <w:basedOn w:val="801"/>
+    <w:link w:val="796"/>
     <w:uiPriority w:val="9"/>
     <w:qFormat/>
     <w:pPr>
@@ -2249,10 +2288,10 @@
       <w:color w:val="0f4761" w:themeColor="accent1" w:themeShade="BF"/>
     </w:rPr>
   </w:style>
-  <w:style w:type="character" w:styleId="805">
+  <w:style w:type="character" w:styleId="807">
     <w:name w:val="Heading 6 Char"/>
-    <w:basedOn w:val="799"/>
-    <w:link w:val="795"/>
+    <w:basedOn w:val="801"/>
+    <w:link w:val="797"/>
     <w:uiPriority w:val="9"/>
     <w:qFormat/>
     <w:pPr>
@@ -2267,10 +2306,10 @@
       <w:color w:val="595959" w:themeColor="text1" w:themeTint="A6"/>
     </w:rPr>
   </w:style>
-  <w:style w:type="character" w:styleId="806">
+  <w:style w:type="character" w:styleId="808">
     <w:name w:val="Heading 7 Char"/>
-    <w:basedOn w:val="799"/>
-    <w:link w:val="796"/>
+    <w:basedOn w:val="801"/>
+    <w:link w:val="798"/>
     <w:uiPriority w:val="9"/>
     <w:qFormat/>
     <w:pPr>
@@ -2283,10 +2322,10 @@
       <w:color w:val="595959" w:themeColor="text1" w:themeTint="A6"/>
     </w:rPr>
   </w:style>
-  <w:style w:type="character" w:styleId="807">
+  <w:style w:type="character" w:styleId="809">
     <w:name w:val="Heading 8 Char"/>
-    <w:basedOn w:val="799"/>
-    <w:link w:val="797"/>
+    <w:basedOn w:val="801"/>
+    <w:link w:val="799"/>
     <w:uiPriority w:val="9"/>
     <w:qFormat/>
     <w:pPr>
@@ -2301,10 +2340,10 @@
       <w:color w:val="272727" w:themeColor="text1" w:themeTint="D8"/>
     </w:rPr>
   </w:style>
-  <w:style w:type="character" w:styleId="808">
+  <w:style w:type="character" w:styleId="810">
     <w:name w:val="Heading 9 Char"/>
-    <w:basedOn w:val="799"/>
-    <w:link w:val="798"/>
+    <w:basedOn w:val="801"/>
+    <w:link w:val="800"/>
     <w:uiPriority w:val="9"/>
     <w:qFormat/>
     <w:pPr>
@@ -2319,10 +2358,10 @@
       <w:color w:val="272727" w:themeColor="text1" w:themeTint="D8"/>
     </w:rPr>
   </w:style>
-  <w:style w:type="character" w:styleId="809">
+  <w:style w:type="character" w:styleId="811">
     <w:name w:val="Title Char"/>
-    <w:basedOn w:val="799"/>
-    <w:link w:val="857"/>
+    <w:basedOn w:val="801"/>
+    <w:link w:val="859"/>
     <w:uiPriority w:val="10"/>
     <w:qFormat/>
     <w:pPr>
@@ -2337,10 +2376,10 @@
       <w:szCs w:val="56"/>
     </w:rPr>
   </w:style>
-  <w:style w:type="character" w:styleId="810">
+  <w:style w:type="character" w:styleId="812">
     <w:name w:val="Subtitle Char"/>
-    <w:basedOn w:val="799"/>
-    <w:link w:val="858"/>
+    <w:basedOn w:val="801"/>
+    <w:link w:val="860"/>
     <w:uiPriority w:val="11"/>
     <w:qFormat/>
     <w:pPr>
@@ -2355,10 +2394,10 @@
       <w:szCs w:val="28"/>
     </w:rPr>
   </w:style>
-  <w:style w:type="character" w:styleId="811">
+  <w:style w:type="character" w:styleId="813">
     <w:name w:val="Quote Char"/>
-    <w:basedOn w:val="799"/>
-    <w:link w:val="836"/>
+    <w:basedOn w:val="801"/>
+    <w:link w:val="838"/>
     <w:uiPriority w:val="29"/>
     <w:qFormat/>
     <w:pPr>
@@ -2372,9 +2411,9 @@
       <w:color w:val="404040" w:themeColor="text1" w:themeTint="BF"/>
     </w:rPr>
   </w:style>
-  <w:style w:type="character" w:styleId="812">
+  <w:style w:type="character" w:styleId="814">
     <w:name w:val="Intense Emphasis"/>
-    <w:basedOn w:val="799"/>
+    <w:basedOn w:val="801"/>
     <w:uiPriority w:val="21"/>
     <w:qFormat/>
     <w:pPr>
@@ -2388,10 +2427,10 @@
       <w:color w:val="0f4761" w:themeColor="accent1" w:themeShade="BF"/>
     </w:rPr>
   </w:style>
-  <w:style w:type="character" w:styleId="813">
+  <w:style w:type="character" w:styleId="815">
     <w:name w:val="Intense Quote Char"/>
-    <w:basedOn w:val="799"/>
-    <w:link w:val="838"/>
+    <w:basedOn w:val="801"/>
+    <w:link w:val="840"/>
     <w:uiPriority w:val="30"/>
     <w:qFormat/>
     <w:pPr>
@@ -2405,9 +2444,9 @@
       <w:color w:val="0f4761" w:themeColor="accent1" w:themeShade="BF"/>
     </w:rPr>
   </w:style>
-  <w:style w:type="character" w:styleId="814">
+  <w:style w:type="character" w:styleId="816">
     <w:name w:val="Intense Reference"/>
-    <w:basedOn w:val="799"/>
+    <w:basedOn w:val="801"/>
     <w:uiPriority w:val="32"/>
     <w:qFormat/>
     <w:pPr>
@@ -2423,9 +2462,9 @@
       <w:spacing w:val="5"/>
     </w:rPr>
   </w:style>
-  <w:style w:type="character" w:styleId="815">
+  <w:style w:type="character" w:styleId="817">
     <w:name w:val="Subtle Emphasis"/>
-    <w:basedOn w:val="799"/>
+    <w:basedOn w:val="801"/>
     <w:uiPriority w:val="19"/>
     <w:qFormat/>
     <w:pPr>
@@ -2439,9 +2478,9 @@
       <w:color w:val="404040" w:themeColor="text1" w:themeTint="BF"/>
     </w:rPr>
   </w:style>
-  <w:style w:type="character" w:styleId="816">
+  <w:style w:type="character" w:styleId="818">
     <w:name w:val="Emphasis"/>
-    <w:basedOn w:val="799"/>
+    <w:basedOn w:val="801"/>
     <w:uiPriority w:val="20"/>
     <w:qFormat/>
     <w:pPr>
@@ -2454,9 +2493,9 @@
       <w:iCs/>
     </w:rPr>
   </w:style>
-  <w:style w:type="character" w:styleId="817">
+  <w:style w:type="character" w:styleId="819">
     <w:name w:val="Strong"/>
-    <w:basedOn w:val="799"/>
+    <w:basedOn w:val="801"/>
     <w:uiPriority w:val="22"/>
     <w:qFormat/>
     <w:pPr>
@@ -2469,9 +2508,9 @@
       <w:bCs/>
     </w:rPr>
   </w:style>
-  <w:style w:type="character" w:styleId="818">
+  <w:style w:type="character" w:styleId="820">
     <w:name w:val="Subtle Reference"/>
-    <w:basedOn w:val="799"/>
+    <w:basedOn w:val="801"/>
     <w:uiPriority w:val="31"/>
     <w:qFormat/>
     <w:pPr>
@@ -2484,9 +2523,9 @@
       <w:color w:val="5a5a5a" w:themeColor="text1" w:themeTint="A5"/>
     </w:rPr>
   </w:style>
-  <w:style w:type="character" w:styleId="819">
+  <w:style w:type="character" w:styleId="821">
     <w:name w:val="Book Title"/>
-    <w:basedOn w:val="799"/>
+    <w:basedOn w:val="801"/>
     <w:uiPriority w:val="33"/>
     <w:qFormat/>
     <w:pPr>
@@ -2502,10 +2541,10 @@
       <w:spacing w:val="5"/>
     </w:rPr>
   </w:style>
-  <w:style w:type="character" w:styleId="820">
+  <w:style w:type="character" w:styleId="822">
     <w:name w:val="Header Char"/>
-    <w:basedOn w:val="799"/>
-    <w:link w:val="860"/>
+    <w:basedOn w:val="801"/>
+    <w:link w:val="862"/>
     <w:uiPriority w:val="99"/>
     <w:qFormat/>
     <w:pPr>
@@ -2514,10 +2553,10 @@
       <w:ind/>
     </w:pPr>
   </w:style>
-  <w:style w:type="character" w:styleId="821">
+  <w:style w:type="character" w:styleId="823">
     <w:name w:val="Footer Char"/>
-    <w:basedOn w:val="799"/>
-    <w:link w:val="841"/>
+    <w:basedOn w:val="801"/>
+    <w:link w:val="843"/>
     <w:uiPriority w:val="99"/>
     <w:qFormat/>
     <w:pPr>
@@ -2526,10 +2565,10 @@
       <w:ind/>
     </w:pPr>
   </w:style>
-  <w:style w:type="character" w:styleId="822">
+  <w:style w:type="character" w:styleId="824">
     <w:name w:val="Footnote Text Char"/>
-    <w:basedOn w:val="799"/>
-    <w:link w:val="842"/>
+    <w:basedOn w:val="801"/>
+    <w:link w:val="844"/>
     <w:uiPriority w:val="99"/>
     <w:semiHidden/>
     <w:qFormat/>
@@ -2543,9 +2582,9 @@
       <w:szCs w:val="20"/>
     </w:rPr>
   </w:style>
-  <w:style w:type="character" w:styleId="823">
+  <w:style w:type="character" w:styleId="825">
     <w:name w:val="Footnote Characters"/>
-    <w:basedOn w:val="799"/>
+    <w:basedOn w:val="801"/>
     <w:uiPriority w:val="99"/>
     <w:semiHidden/>
     <w:unhideWhenUsed/>
@@ -2559,7 +2598,7 @@
       <w:vertAlign w:val="superscript"/>
     </w:rPr>
   </w:style>
-  <w:style w:type="character" w:styleId="824">
+  <w:style w:type="character" w:styleId="826">
     <w:name w:val="footnote reference"/>
     <w:pPr>
       <w:pBdr/>
@@ -2570,10 +2609,10 @@
       <w:vertAlign w:val="superscript"/>
     </w:rPr>
   </w:style>
-  <w:style w:type="character" w:styleId="825">
+  <w:style w:type="character" w:styleId="827">
     <w:name w:val="Endnote Text Char"/>
-    <w:basedOn w:val="799"/>
-    <w:link w:val="843"/>
+    <w:basedOn w:val="801"/>
+    <w:link w:val="845"/>
     <w:uiPriority w:val="99"/>
     <w:semiHidden/>
     <w:qFormat/>
@@ -2587,9 +2626,9 @@
       <w:szCs w:val="20"/>
     </w:rPr>
   </w:style>
-  <w:style w:type="character" w:styleId="826">
+  <w:style w:type="character" w:styleId="828">
     <w:name w:val="Endnote Characters"/>
-    <w:basedOn w:val="799"/>
+    <w:basedOn w:val="801"/>
     <w:uiPriority w:val="99"/>
     <w:semiHidden/>
     <w:unhideWhenUsed/>
@@ -2603,7 +2642,7 @@
       <w:vertAlign w:val="superscript"/>
     </w:rPr>
   </w:style>
-  <w:style w:type="character" w:styleId="827">
+  <w:style w:type="character" w:styleId="829">
     <w:name w:val="endnote reference"/>
     <w:pPr>
       <w:pBdr/>
@@ -2614,9 +2653,9 @@
       <w:vertAlign w:val="superscript"/>
     </w:rPr>
   </w:style>
-  <w:style w:type="character" w:styleId="828">
+  <w:style w:type="character" w:styleId="830">
     <w:name w:val="Hyperlink"/>
-    <w:basedOn w:val="799"/>
+    <w:basedOn w:val="801"/>
     <w:uiPriority w:val="99"/>
     <w:unhideWhenUsed/>
     <w:pPr>
@@ -2629,9 +2668,9 @@
       <w:u w:val="single"/>
     </w:rPr>
   </w:style>
-  <w:style w:type="character" w:styleId="829">
+  <w:style w:type="character" w:styleId="831">
     <w:name w:val="FollowedHyperlink"/>
-    <w:basedOn w:val="799"/>
+    <w:basedOn w:val="801"/>
     <w:uiPriority w:val="99"/>
     <w:semiHidden/>
     <w:unhideWhenUsed/>
@@ -2645,9 +2684,9 @@
       <w:u w:val="single"/>
     </w:rPr>
   </w:style>
-  <w:style w:type="character" w:styleId="830">
+  <w:style w:type="character" w:styleId="832">
     <w:name w:val="Placeholder Text"/>
-    <w:basedOn w:val="799"/>
+    <w:basedOn w:val="801"/>
     <w:uiPriority w:val="99"/>
     <w:semiHidden/>
     <w:qFormat/>
@@ -2660,10 +2699,10 @@
       <w:color w:val="666666"/>
     </w:rPr>
   </w:style>
-  <w:style w:type="paragraph" w:styleId="831">
+  <w:style w:type="paragraph" w:styleId="833">
     <w:name w:val="Heading"/>
-    <w:basedOn w:val="789"/>
-    <w:next w:val="832"/>
+    <w:basedOn w:val="791"/>
+    <w:next w:val="834"/>
     <w:qFormat/>
     <w:pPr>
       <w:keepNext w:val="true"/>
@@ -2677,18 +2716,18 @@
       <w:szCs w:val="28"/>
     </w:rPr>
   </w:style>
-  <w:style w:type="paragraph" w:styleId="832">
+  <w:style w:type="paragraph" w:styleId="834">
     <w:name w:val="Body Text"/>
-    <w:basedOn w:val="789"/>
+    <w:basedOn w:val="791"/>
     <w:pPr>
       <w:pBdr/>
       <w:spacing w:after="140" w:before="0" w:line="276" w:lineRule="auto"/>
       <w:ind/>
     </w:pPr>
   </w:style>
-  <w:style w:type="paragraph" w:styleId="833">
+  <w:style w:type="paragraph" w:styleId="835">
     <w:name w:val="List"/>
-    <w:basedOn w:val="832"/>
+    <w:basedOn w:val="834"/>
     <w:pPr>
       <w:pBdr/>
       <w:spacing/>
@@ -2698,9 +2737,9 @@
       <w:rFonts w:cs="Noto Sans Devanagari"/>
     </w:rPr>
   </w:style>
-  <w:style w:type="paragraph" w:styleId="834">
+  <w:style w:type="paragraph" w:styleId="836">
     <w:name w:val="Caption"/>
-    <w:basedOn w:val="789"/>
+    <w:basedOn w:val="791"/>
     <w:qFormat/>
     <w:pPr>
       <w:suppressLineNumbers w:val="true"/>
@@ -2716,9 +2755,9 @@
       <w:szCs w:val="24"/>
     </w:rPr>
   </w:style>
-  <w:style w:type="paragraph" w:styleId="835">
+  <w:style w:type="paragraph" w:styleId="837">
     <w:name w:val="Index"/>
-    <w:basedOn w:val="789"/>
+    <w:basedOn w:val="791"/>
     <w:qFormat/>
     <w:pPr>
       <w:suppressLineNumbers w:val="true"/>
@@ -2730,11 +2769,11 @@
       <w:rFonts w:cs="Noto Sans Devanagari"/>
     </w:rPr>
   </w:style>
-  <w:style w:type="paragraph" w:styleId="836">
+  <w:style w:type="paragraph" w:styleId="838">
     <w:name w:val="Quote"/>
-    <w:basedOn w:val="789"/>
-    <w:next w:val="789"/>
-    <w:link w:val="811"/>
+    <w:basedOn w:val="791"/>
+    <w:next w:val="791"/>
+    <w:link w:val="813"/>
     <w:uiPriority w:val="29"/>
     <w:qFormat/>
     <w:pPr>
@@ -2749,9 +2788,9 @@
       <w:color w:val="404040" w:themeColor="text1" w:themeTint="BF"/>
     </w:rPr>
   </w:style>
-  <w:style w:type="paragraph" w:styleId="837">
+  <w:style w:type="paragraph" w:styleId="839">
     <w:name w:val="List Paragraph"/>
-    <w:basedOn w:val="789"/>
+    <w:basedOn w:val="791"/>
     <w:uiPriority w:val="34"/>
     <w:qFormat/>
     <w:pPr>
@@ -2761,11 +2800,11 @@
       <w:contextualSpacing w:val="true"/>
     </w:pPr>
   </w:style>
-  <w:style w:type="paragraph" w:styleId="838">
+  <w:style w:type="paragraph" w:styleId="840">
     <w:name w:val="Intense Quote"/>
-    <w:basedOn w:val="789"/>
-    <w:next w:val="789"/>
-    <w:link w:val="813"/>
+    <w:basedOn w:val="791"/>
+    <w:next w:val="791"/>
+    <w:link w:val="815"/>
     <w:uiPriority w:val="30"/>
     <w:qFormat/>
     <w:pPr>
@@ -2783,9 +2822,9 @@
       <w:color w:val="0f4761" w:themeColor="accent1" w:themeShade="BF"/>
     </w:rPr>
   </w:style>
-  <w:style w:type="paragraph" w:styleId="839">
+  <w:style w:type="paragraph" w:styleId="841">
     <w:name w:val="No Spacing"/>
-    <w:basedOn w:val="789"/>
+    <w:basedOn w:val="791"/>
     <w:uiPriority w:val="1"/>
     <w:qFormat/>
     <w:pPr>
@@ -2794,9 +2833,9 @@
       <w:ind/>
     </w:pPr>
   </w:style>
-  <w:style w:type="paragraph" w:styleId="840">
+  <w:style w:type="paragraph" w:styleId="842">
     <w:name w:val="Header and Footer"/>
-    <w:basedOn w:val="789"/>
+    <w:basedOn w:val="791"/>
     <w:qFormat/>
     <w:pPr>
       <w:pBdr/>
@@ -2804,10 +2843,10 @@
       <w:ind/>
     </w:pPr>
   </w:style>
-  <w:style w:type="paragraph" w:styleId="841">
+  <w:style w:type="paragraph" w:styleId="843">
     <w:name w:val="Footer"/>
-    <w:basedOn w:val="789"/>
-    <w:link w:val="821"/>
+    <w:basedOn w:val="791"/>
+    <w:link w:val="823"/>
     <w:uiPriority w:val="99"/>
     <w:unhideWhenUsed/>
     <w:pPr>
@@ -2821,10 +2860,10 @@
       <w:ind/>
     </w:pPr>
   </w:style>
-  <w:style w:type="paragraph" w:styleId="842">
+  <w:style w:type="paragraph" w:styleId="844">
     <w:name w:val="footnote text"/>
-    <w:basedOn w:val="789"/>
-    <w:link w:val="822"/>
+    <w:basedOn w:val="791"/>
+    <w:link w:val="824"/>
     <w:uiPriority w:val="99"/>
     <w:semiHidden/>
     <w:unhideWhenUsed/>
@@ -2838,10 +2877,10 @@
       <w:szCs w:val="20"/>
     </w:rPr>
   </w:style>
-  <w:style w:type="paragraph" w:styleId="843">
+  <w:style w:type="paragraph" w:styleId="845">
     <w:name w:val="endnote text"/>
-    <w:basedOn w:val="789"/>
-    <w:link w:val="825"/>
+    <w:basedOn w:val="791"/>
+    <w:link w:val="827"/>
     <w:uiPriority w:val="99"/>
     <w:semiHidden/>
     <w:unhideWhenUsed/>
@@ -2855,10 +2894,10 @@
       <w:szCs w:val="20"/>
     </w:rPr>
   </w:style>
-  <w:style w:type="paragraph" w:styleId="844">
+  <w:style w:type="paragraph" w:styleId="846">
     <w:name w:val="toc 1"/>
-    <w:basedOn w:val="789"/>
-    <w:next w:val="789"/>
+    <w:basedOn w:val="791"/>
+    <w:next w:val="791"/>
     <w:uiPriority w:val="39"/>
     <w:unhideWhenUsed/>
     <w:pPr>
@@ -2867,10 +2906,10 @@
       <w:ind/>
     </w:pPr>
   </w:style>
-  <w:style w:type="paragraph" w:styleId="845">
+  <w:style w:type="paragraph" w:styleId="847">
     <w:name w:val="toc 2"/>
-    <w:basedOn w:val="789"/>
-    <w:next w:val="789"/>
+    <w:basedOn w:val="791"/>
+    <w:next w:val="791"/>
     <w:uiPriority w:val="39"/>
     <w:unhideWhenUsed/>
     <w:pPr>
@@ -2879,10 +2918,10 @@
       <w:ind w:left="220"/>
     </w:pPr>
   </w:style>
-  <w:style w:type="paragraph" w:styleId="846">
+  <w:style w:type="paragraph" w:styleId="848">
     <w:name w:val="toc 3"/>
-    <w:basedOn w:val="789"/>
-    <w:next w:val="789"/>
+    <w:basedOn w:val="791"/>
+    <w:next w:val="791"/>
     <w:uiPriority w:val="39"/>
     <w:unhideWhenUsed/>
     <w:pPr>
@@ -2891,10 +2930,10 @@
       <w:ind w:left="440"/>
     </w:pPr>
   </w:style>
-  <w:style w:type="paragraph" w:styleId="847">
+  <w:style w:type="paragraph" w:styleId="849">
     <w:name w:val="toc 4"/>
-    <w:basedOn w:val="789"/>
-    <w:next w:val="789"/>
+    <w:basedOn w:val="791"/>
+    <w:next w:val="791"/>
     <w:uiPriority w:val="39"/>
     <w:unhideWhenUsed/>
     <w:pPr>
@@ -2903,10 +2942,10 @@
       <w:ind w:left="660"/>
     </w:pPr>
   </w:style>
-  <w:style w:type="paragraph" w:styleId="848">
+  <w:style w:type="paragraph" w:styleId="850">
     <w:name w:val="toc 5"/>
-    <w:basedOn w:val="789"/>
-    <w:next w:val="789"/>
+    <w:basedOn w:val="791"/>
+    <w:next w:val="791"/>
     <w:uiPriority w:val="39"/>
     <w:unhideWhenUsed/>
     <w:pPr>
@@ -2915,10 +2954,10 @@
       <w:ind w:left="880"/>
     </w:pPr>
   </w:style>
-  <w:style w:type="paragraph" w:styleId="849">
+  <w:style w:type="paragraph" w:styleId="851">
     <w:name w:val="toc 6"/>
-    <w:basedOn w:val="789"/>
-    <w:next w:val="789"/>
+    <w:basedOn w:val="791"/>
+    <w:next w:val="791"/>
     <w:uiPriority w:val="39"/>
     <w:unhideWhenUsed/>
     <w:pPr>
@@ -2927,10 +2966,10 @@
       <w:ind w:left="1100"/>
     </w:pPr>
   </w:style>
-  <w:style w:type="paragraph" w:styleId="850">
+  <w:style w:type="paragraph" w:styleId="852">
     <w:name w:val="toc 7"/>
-    <w:basedOn w:val="789"/>
-    <w:next w:val="789"/>
+    <w:basedOn w:val="791"/>
+    <w:next w:val="791"/>
     <w:uiPriority w:val="39"/>
     <w:unhideWhenUsed/>
     <w:pPr>
@@ -2939,10 +2978,10 @@
       <w:ind w:left="1320"/>
     </w:pPr>
   </w:style>
-  <w:style w:type="paragraph" w:styleId="851">
+  <w:style w:type="paragraph" w:styleId="853">
     <w:name w:val="toc 8"/>
-    <w:basedOn w:val="789"/>
-    <w:next w:val="789"/>
+    <w:basedOn w:val="791"/>
+    <w:next w:val="791"/>
     <w:uiPriority w:val="39"/>
     <w:unhideWhenUsed/>
     <w:pPr>
@@ -2951,10 +2990,10 @@
       <w:ind w:left="1540"/>
     </w:pPr>
   </w:style>
-  <w:style w:type="paragraph" w:styleId="852">
+  <w:style w:type="paragraph" w:styleId="854">
     <w:name w:val="toc 9"/>
-    <w:basedOn w:val="789"/>
-    <w:next w:val="789"/>
+    <w:basedOn w:val="791"/>
+    <w:next w:val="791"/>
     <w:uiPriority w:val="39"/>
     <w:unhideWhenUsed/>
     <w:pPr>
@@ -2963,16 +3002,16 @@
       <w:ind w:left="1760"/>
     </w:pPr>
   </w:style>
-  <w:style w:type="paragraph" w:styleId="853">
+  <w:style w:type="paragraph" w:styleId="855">
     <w:name w:val="index heading"/>
-    <w:basedOn w:val="831"/>
+    <w:basedOn w:val="833"/>
     <w:pPr>
       <w:pBdr/>
       <w:spacing/>
       <w:ind/>
     </w:pPr>
   </w:style>
-  <w:style w:type="paragraph" w:styleId="854">
+  <w:style w:type="paragraph" w:styleId="856">
     <w:name w:val="TOC Heading"/>
     <w:uiPriority w:val="39"/>
     <w:unhideWhenUsed/>
@@ -2993,10 +3032,10 @@
       <w:lang w:val="es-MX" w:eastAsia="zh-CN" w:bidi="hi-IN"/>
     </w:rPr>
   </w:style>
-  <w:style w:type="paragraph" w:styleId="855">
+  <w:style w:type="paragraph" w:styleId="857">
     <w:name w:val="table of figures"/>
-    <w:basedOn w:val="789"/>
-    <w:next w:val="789"/>
+    <w:basedOn w:val="791"/>
+    <w:next w:val="791"/>
     <w:uiPriority w:val="99"/>
     <w:unhideWhenUsed/>
     <w:pPr>
@@ -3005,7 +3044,7 @@
       <w:ind/>
     </w:pPr>
   </w:style>
-  <w:style w:type="paragraph" w:styleId="856">
+  <w:style w:type="paragraph" w:styleId="858">
     <w:name w:val="normal1"/>
     <w:qFormat/>
     <w:pPr>
@@ -3024,10 +3063,10 @@
       <w:lang w:val="es-MX" w:eastAsia="zh-CN" w:bidi="hi-IN"/>
     </w:rPr>
   </w:style>
-  <w:style w:type="paragraph" w:styleId="857">
+  <w:style w:type="paragraph" w:styleId="859">
     <w:name w:val="Title"/>
-    <w:basedOn w:val="856"/>
-    <w:next w:val="856"/>
+    <w:basedOn w:val="858"/>
+    <w:next w:val="858"/>
     <w:qFormat/>
     <w:pPr>
       <w:keepNext w:val="true"/>
@@ -3044,10 +3083,10 @@
       <w:szCs w:val="72"/>
     </w:rPr>
   </w:style>
-  <w:style w:type="paragraph" w:styleId="858">
+  <w:style w:type="paragraph" w:styleId="860">
     <w:name w:val="Subtitle"/>
-    <w:basedOn w:val="856"/>
-    <w:next w:val="856"/>
+    <w:basedOn w:val="858"/>
+    <w:next w:val="858"/>
     <w:qFormat/>
     <w:pPr>
       <w:keepNext w:val="true"/>
@@ -3066,28 +3105,9 @@
       <w:szCs w:val="48"/>
     </w:rPr>
   </w:style>
-  <w:style w:type="paragraph" w:styleId="859">
+  <w:style w:type="paragraph" w:styleId="861">
     <w:name w:val="Frame Contents"/>
-    <w:basedOn w:val="789"/>
-    <w:qFormat/>
-    <w:pPr>
-      <w:pBdr/>
-      <w:spacing/>
-      <w:ind/>
-    </w:pPr>
-  </w:style>
-  <w:style w:type="paragraph" w:styleId="860">
-    <w:name w:val="Header"/>
-    <w:basedOn w:val="840"/>
-    <w:pPr>
-      <w:pBdr/>
-      <w:spacing/>
-      <w:ind/>
-    </w:pPr>
-  </w:style>
-  <w:style w:type="paragraph" w:styleId="861">
-    <w:name w:val="Frame Contents (user)"/>
-    <w:basedOn w:val="789"/>
+    <w:basedOn w:val="791"/>
     <w:qFormat/>
     <w:pPr>
       <w:pBdr/>
@@ -3096,8 +3116,27 @@
     </w:pPr>
   </w:style>
   <w:style w:type="paragraph" w:styleId="862">
+    <w:name w:val="Header"/>
+    <w:basedOn w:val="842"/>
+    <w:pPr>
+      <w:pBdr/>
+      <w:spacing/>
+      <w:ind/>
+    </w:pPr>
+  </w:style>
+  <w:style w:type="paragraph" w:styleId="863">
+    <w:name w:val="Frame Contents (user)"/>
+    <w:basedOn w:val="791"/>
+    <w:qFormat/>
+    <w:pPr>
+      <w:pBdr/>
+      <w:spacing/>
+      <w:ind/>
+    </w:pPr>
+  </w:style>
+  <w:style w:type="paragraph" w:styleId="864">
     <w:name w:val="Table Contents"/>
-    <w:basedOn w:val="789"/>
+    <w:basedOn w:val="791"/>
     <w:qFormat/>
     <w:pPr>
       <w:widowControl w:val="false"/>
@@ -3107,9 +3146,9 @@
       <w:ind/>
     </w:pPr>
   </w:style>
-  <w:style w:type="paragraph" w:styleId="863">
+  <w:style w:type="paragraph" w:styleId="865">
     <w:name w:val="Table Heading"/>
-    <w:basedOn w:val="862"/>
+    <w:basedOn w:val="864"/>
     <w:qFormat/>
     <w:pPr>
       <w:suppressLineNumbers w:val="true"/>
@@ -3123,7 +3162,7 @@
       <w:bCs/>
     </w:rPr>
   </w:style>
-  <w:style w:type="numbering" w:styleId="864" w:default="1">
+  <w:style w:type="numbering" w:styleId="866" w:default="1">
     <w:name w:val="No List"/>
     <w:uiPriority w:val="99"/>
     <w:semiHidden/>
@@ -3135,7 +3174,7 @@
       <w:ind/>
     </w:pPr>
   </w:style>
-  <w:style w:type="table" w:styleId="865" w:default="1">
+  <w:style w:type="table" w:styleId="867" w:default="1">
     <w:name w:val="Normal Table"/>
     <w:uiPriority w:val="99"/>
     <w:semiHidden/>
@@ -3327,9 +3366,9 @@
       </w:tcPr>
     </w:tblStylePr>
   </w:style>
-  <w:style w:type="table" w:styleId="866">
+  <w:style w:type="table" w:styleId="868">
     <w:name w:val="Table Grid"/>
-    <w:basedOn w:val="865"/>
+    <w:basedOn w:val="867"/>
     <w:uiPriority w:val="59"/>
     <w:pPr>
       <w:pBdr/>
@@ -3525,9 +3564,9 @@
       </w:tcPr>
     </w:tblStylePr>
   </w:style>
-  <w:style w:type="table" w:styleId="867">
+  <w:style w:type="table" w:styleId="869">
     <w:name w:val="Table Grid Light"/>
-    <w:basedOn w:val="865"/>
+    <w:basedOn w:val="867"/>
     <w:uiPriority w:val="59"/>
     <w:pPr>
       <w:pBdr/>
@@ -3723,9 +3762,9 @@
       </w:tcPr>
     </w:tblStylePr>
   </w:style>
-  <w:style w:type="table" w:styleId="868">
+  <w:style w:type="table" w:styleId="870">
     <w:name w:val="Plain Table 1"/>
-    <w:basedOn w:val="865"/>
+    <w:basedOn w:val="867"/>
     <w:uiPriority w:val="59"/>
     <w:pPr>
       <w:pBdr/>
@@ -3939,9 +3978,9 @@
       </w:tcPr>
     </w:tblStylePr>
   </w:style>
-  <w:style w:type="table" w:styleId="869">
+  <w:style w:type="table" w:styleId="871">
     <w:name w:val="Plain Table 2"/>
-    <w:basedOn w:val="865"/>
+    <w:basedOn w:val="867"/>
     <w:uiPriority w:val="59"/>
     <w:pPr>
       <w:pBdr/>
@@ -4163,9 +4202,9 @@
       </w:tcPr>
     </w:tblStylePr>
   </w:style>
-  <w:style w:type="table" w:styleId="870">
+  <w:style w:type="table" w:styleId="872">
     <w:name w:val="Plain Table 3"/>
-    <w:basedOn w:val="865"/>
+    <w:basedOn w:val="867"/>
     <w:uiPriority w:val="99"/>
     <w:pPr>
       <w:pBdr/>
@@ -4384,9 +4423,9 @@
       </w:tcPr>
     </w:tblStylePr>
   </w:style>
-  <w:style w:type="table" w:styleId="871">
+  <w:style w:type="table" w:styleId="873">
     <w:name w:val="Plain Table 4"/>
-    <w:basedOn w:val="865"/>
+    <w:basedOn w:val="867"/>
     <w:uiPriority w:val="99"/>
     <w:pPr>
       <w:pBdr/>
@@ -4591,9 +4630,9 @@
       </w:tcPr>
     </w:tblStylePr>
   </w:style>
-  <w:style w:type="table" w:styleId="872">
+  <w:style w:type="table" w:styleId="874">
     <w:name w:val="Plain Table 5"/>
-    <w:basedOn w:val="865"/>
+    <w:basedOn w:val="867"/>
     <w:uiPriority w:val="99"/>
     <w:pPr>
       <w:pBdr/>
@@ -4815,9 +4854,9 @@
       </w:tcPr>
     </w:tblStylePr>
   </w:style>
-  <w:style w:type="table" w:styleId="873">
+  <w:style w:type="table" w:styleId="875">
     <w:name w:val="Grid Table 1 Light"/>
-    <w:basedOn w:val="865"/>
+    <w:basedOn w:val="867"/>
     <w:uiPriority w:val="99"/>
     <w:pPr>
       <w:pBdr/>
@@ -5031,9 +5070,9 @@
       </w:tcPr>
     </w:tblStylePr>
   </w:style>
-  <w:style w:type="table" w:styleId="874">
+  <w:style w:type="table" w:styleId="876">
     <w:name w:val="Grid Table 1 Light - Accent 1"/>
-    <w:basedOn w:val="865"/>
+    <w:basedOn w:val="867"/>
     <w:uiPriority w:val="99"/>
     <w:pPr>
       <w:pBdr/>
@@ -5247,9 +5286,9 @@
       </w:tcPr>
     </w:tblStylePr>
   </w:style>
-  <w:style w:type="table" w:styleId="875">
+  <w:style w:type="table" w:styleId="877">
     <w:name w:val="Grid Table 1 Light - Accent 2"/>
-    <w:basedOn w:val="865"/>
+    <w:basedOn w:val="867"/>
     <w:uiPriority w:val="99"/>
     <w:pPr>
       <w:pBdr/>
@@ -5463,9 +5502,9 @@
       </w:tcPr>
     </w:tblStylePr>
   </w:style>
-  <w:style w:type="table" w:styleId="876">
+  <w:style w:type="table" w:styleId="878">
     <w:name w:val="Grid Table 1 Light - Accent 3"/>
-    <w:basedOn w:val="865"/>
+    <w:basedOn w:val="867"/>
     <w:uiPriority w:val="99"/>
     <w:pPr>
       <w:pBdr/>
@@ -5679,9 +5718,9 @@
       </w:tcPr>
     </w:tblStylePr>
   </w:style>
-  <w:style w:type="table" w:styleId="877">
+  <w:style w:type="table" w:styleId="879">
     <w:name w:val="Grid Table 1 Light - Accent 4"/>
-    <w:basedOn w:val="865"/>
+    <w:basedOn w:val="867"/>
     <w:uiPriority w:val="99"/>
     <w:pPr>
       <w:pBdr/>
@@ -5895,9 +5934,9 @@
       </w:tcPr>
     </w:tblStylePr>
   </w:style>
-  <w:style w:type="table" w:styleId="878">
+  <w:style w:type="table" w:styleId="880">
     <w:name w:val="Grid Table 1 Light - Accent 5"/>
-    <w:basedOn w:val="865"/>
+    <w:basedOn w:val="867"/>
     <w:uiPriority w:val="99"/>
     <w:pPr>
       <w:pBdr/>
@@ -6111,9 +6150,9 @@
       </w:tcPr>
     </w:tblStylePr>
   </w:style>
-  <w:style w:type="table" w:styleId="879">
+  <w:style w:type="table" w:styleId="881">
     <w:name w:val="Grid Table 1 Light - Accent 6"/>
-    <w:basedOn w:val="865"/>
+    <w:basedOn w:val="867"/>
     <w:uiPriority w:val="99"/>
     <w:pPr>
       <w:pBdr/>
@@ -6327,9 +6366,9 @@
       </w:tcPr>
     </w:tblStylePr>
   </w:style>
-  <w:style w:type="table" w:styleId="880">
+  <w:style w:type="table" w:styleId="882">
     <w:name w:val="Grid Table 2"/>
-    <w:basedOn w:val="865"/>
+    <w:basedOn w:val="867"/>
     <w:uiPriority w:val="99"/>
     <w:pPr>
       <w:pBdr/>
@@ -6550,9 +6589,9 @@
       </w:tcPr>
     </w:tblStylePr>
   </w:style>
-  <w:style w:type="table" w:styleId="881">
+  <w:style w:type="table" w:styleId="883">
     <w:name w:val="Grid Table 2 - Accent 1"/>
-    <w:basedOn w:val="865"/>
+    <w:basedOn w:val="867"/>
     <w:uiPriority w:val="99"/>
     <w:pPr>
       <w:pBdr/>
@@ -6773,9 +6812,9 @@
       </w:tcPr>
     </w:tblStylePr>
   </w:style>
-  <w:style w:type="table" w:styleId="882">
+  <w:style w:type="table" w:styleId="884">
     <w:name w:val="Grid Table 2 - Accent 2"/>
-    <w:basedOn w:val="865"/>
+    <w:basedOn w:val="867"/>
     <w:uiPriority w:val="99"/>
     <w:pPr>
       <w:pBdr/>
@@ -6996,9 +7035,9 @@
       </w:tcPr>
     </w:tblStylePr>
   </w:style>
-  <w:style w:type="table" w:styleId="883">
+  <w:style w:type="table" w:styleId="885">
     <w:name w:val="Grid Table 2 - Accent 3"/>
-    <w:basedOn w:val="865"/>
+    <w:basedOn w:val="867"/>
     <w:uiPriority w:val="99"/>
     <w:pPr>
       <w:pBdr/>
@@ -7219,9 +7258,9 @@
       </w:tcPr>
     </w:tblStylePr>
   </w:style>
-  <w:style w:type="table" w:styleId="884">
+  <w:style w:type="table" w:styleId="886">
     <w:name w:val="Grid Table 2 - Accent 4"/>
-    <w:basedOn w:val="865"/>
+    <w:basedOn w:val="867"/>
     <w:uiPriority w:val="99"/>
     <w:pPr>
       <w:pBdr/>
@@ -7442,9 +7481,9 @@
       </w:tcPr>
     </w:tblStylePr>
   </w:style>
-  <w:style w:type="table" w:styleId="885">
+  <w:style w:type="table" w:styleId="887">
     <w:name w:val="Grid Table 2 - Accent 5"/>
-    <w:basedOn w:val="865"/>
+    <w:basedOn w:val="867"/>
     <w:uiPriority w:val="99"/>
     <w:pPr>
       <w:pBdr/>
@@ -7665,9 +7704,9 @@
       </w:tcPr>
     </w:tblStylePr>
   </w:style>
-  <w:style w:type="table" w:styleId="886">
+  <w:style w:type="table" w:styleId="888">
     <w:name w:val="Grid Table 2 - Accent 6"/>
-    <w:basedOn w:val="865"/>
+    <w:basedOn w:val="867"/>
     <w:uiPriority w:val="99"/>
     <w:pPr>
       <w:pBdr/>
@@ -7888,9 +7927,9 @@
       </w:tcPr>
     </w:tblStylePr>
   </w:style>
-  <w:style w:type="table" w:styleId="887">
+  <w:style w:type="table" w:styleId="889">
     <w:name w:val="Grid Table 3"/>
-    <w:basedOn w:val="865"/>
+    <w:basedOn w:val="867"/>
     <w:uiPriority w:val="99"/>
     <w:pPr>
       <w:pBdr/>
@@ -8124,9 +8163,9 @@
       </w:tcPr>
     </w:tblStylePr>
   </w:style>
-  <w:style w:type="table" w:styleId="888">
+  <w:style w:type="table" w:styleId="890">
     <w:name w:val="Grid Table 3 - Accent 1"/>
-    <w:basedOn w:val="865"/>
+    <w:basedOn w:val="867"/>
     <w:uiPriority w:val="99"/>
     <w:pPr>
       <w:pBdr/>
@@ -8360,9 +8399,9 @@
       </w:tcPr>
     </w:tblStylePr>
   </w:style>
-  <w:style w:type="table" w:styleId="889">
+  <w:style w:type="table" w:styleId="891">
     <w:name w:val="Grid Table 3 - Accent 2"/>
-    <w:basedOn w:val="865"/>
+    <w:basedOn w:val="867"/>
     <w:uiPriority w:val="99"/>
     <w:pPr>
       <w:pBdr/>
@@ -8596,9 +8635,9 @@
       </w:tcPr>
     </w:tblStylePr>
   </w:style>
-  <w:style w:type="table" w:styleId="890">
+  <w:style w:type="table" w:styleId="892">
     <w:name w:val="Grid Table 3 - Accent 3"/>
-    <w:basedOn w:val="865"/>
+    <w:basedOn w:val="867"/>
     <w:uiPriority w:val="99"/>
     <w:pPr>
       <w:pBdr/>
@@ -8832,9 +8871,9 @@
       </w:tcPr>
     </w:tblStylePr>
   </w:style>
-  <w:style w:type="table" w:styleId="891">
+  <w:style w:type="table" w:styleId="893">
     <w:name w:val="Grid Table 3 - Accent 4"/>
-    <w:basedOn w:val="865"/>
+    <w:basedOn w:val="867"/>
     <w:uiPriority w:val="99"/>
     <w:pPr>
       <w:pBdr/>
@@ -9068,9 +9107,9 @@
       </w:tcPr>
     </w:tblStylePr>
   </w:style>
-  <w:style w:type="table" w:styleId="892">
+  <w:style w:type="table" w:styleId="894">
     <w:name w:val="Grid Table 3 - Accent 5"/>
-    <w:basedOn w:val="865"/>
+    <w:basedOn w:val="867"/>
     <w:uiPriority w:val="99"/>
     <w:pPr>
       <w:pBdr/>
@@ -9304,9 +9343,9 @@
       </w:tcPr>
     </w:tblStylePr>
   </w:style>
-  <w:style w:type="table" w:styleId="893">
+  <w:style w:type="table" w:styleId="895">
     <w:name w:val="Grid Table 3 - Accent 6"/>
-    <w:basedOn w:val="865"/>
+    <w:basedOn w:val="867"/>
     <w:uiPriority w:val="99"/>
     <w:pPr>
       <w:pBdr/>
@@ -9540,9 +9579,9 @@
       </w:tcPr>
     </w:tblStylePr>
   </w:style>
-  <w:style w:type="table" w:styleId="894">
+  <w:style w:type="table" w:styleId="896">
     <w:name w:val="Grid Table 4"/>
-    <w:basedOn w:val="865"/>
+    <w:basedOn w:val="867"/>
     <w:uiPriority w:val="59"/>
     <w:pPr>
       <w:pBdr/>
@@ -9763,9 +9802,9 @@
       </w:tcPr>
     </w:tblStylePr>
   </w:style>
-  <w:style w:type="table" w:styleId="895">
+  <w:style w:type="table" w:styleId="897">
     <w:name w:val="Grid Table 4 - Accent 1"/>
-    <w:basedOn w:val="865"/>
+    <w:basedOn w:val="867"/>
     <w:uiPriority w:val="59"/>
     <w:pPr>
       <w:pBdr/>
@@ -9986,9 +10025,9 @@
       </w:tcPr>
     </w:tblStylePr>
   </w:style>
-  <w:style w:type="table" w:styleId="896">
+  <w:style w:type="table" w:styleId="898">
     <w:name w:val="Grid Table 4 - Accent 2"/>
-    <w:basedOn w:val="865"/>
+    <w:basedOn w:val="867"/>
     <w:uiPriority w:val="59"/>
     <w:pPr>
       <w:pBdr/>
@@ -10209,9 +10248,9 @@
       </w:tcPr>
     </w:tblStylePr>
   </w:style>
-  <w:style w:type="table" w:styleId="897">
+  <w:style w:type="table" w:styleId="899">
     <w:name w:val="Grid Table 4 - Accent 3"/>
-    <w:basedOn w:val="865"/>
+    <w:basedOn w:val="867"/>
     <w:uiPriority w:val="59"/>
     <w:pPr>
       <w:pBdr/>
@@ -10432,9 +10471,9 @@
       </w:tcPr>
     </w:tblStylePr>
   </w:style>
-  <w:style w:type="table" w:styleId="898">
+  <w:style w:type="table" w:styleId="900">
     <w:name w:val="Grid Table 4 - Accent 4"/>
-    <w:basedOn w:val="865"/>
+    <w:basedOn w:val="867"/>
     <w:uiPriority w:val="59"/>
     <w:pPr>
       <w:pBdr/>
@@ -10655,9 +10694,9 @@
       </w:tcPr>
     </w:tblStylePr>
   </w:style>
-  <w:style w:type="table" w:styleId="899">
+  <w:style w:type="table" w:styleId="901">
     <w:name w:val="Grid Table 4 - Accent 5"/>
-    <w:basedOn w:val="865"/>
+    <w:basedOn w:val="867"/>
     <w:uiPriority w:val="59"/>
     <w:pPr>
       <w:pBdr/>
@@ -10878,9 +10917,9 @@
       </w:tcPr>
     </w:tblStylePr>
   </w:style>
-  <w:style w:type="table" w:styleId="900">
+  <w:style w:type="table" w:styleId="902">
     <w:name w:val="Grid Table 4 - Accent 6"/>
-    <w:basedOn w:val="865"/>
+    <w:basedOn w:val="867"/>
     <w:uiPriority w:val="59"/>
     <w:pPr>
       <w:pBdr/>
@@ -11101,9 +11140,9 @@
       </w:tcPr>
     </w:tblStylePr>
   </w:style>
-  <w:style w:type="table" w:styleId="901">
+  <w:style w:type="table" w:styleId="903">
     <w:name w:val="Grid Table 5 Dark"/>
-    <w:basedOn w:val="865"/>
+    <w:basedOn w:val="867"/>
     <w:uiPriority w:val="99"/>
     <w:pPr>
       <w:pBdr/>
@@ -11319,9 +11358,9 @@
       </w:tcPr>
     </w:tblStylePr>
   </w:style>
-  <w:style w:type="table" w:styleId="902">
+  <w:style w:type="table" w:styleId="904">
     <w:name w:val="Grid Table 5 Dark- Accent 1"/>
-    <w:basedOn w:val="865"/>
+    <w:basedOn w:val="867"/>
     <w:uiPriority w:val="99"/>
     <w:pPr>
       <w:pBdr/>
@@ -11537,9 +11576,9 @@
       </w:tcPr>
     </w:tblStylePr>
   </w:style>
-  <w:style w:type="table" w:styleId="903">
+  <w:style w:type="table" w:styleId="905">
     <w:name w:val="Grid Table 5 Dark - Accent 2"/>
-    <w:basedOn w:val="865"/>
+    <w:basedOn w:val="867"/>
     <w:uiPriority w:val="99"/>
     <w:pPr>
       <w:pBdr/>
@@ -11755,9 +11794,9 @@
       </w:tcPr>
     </w:tblStylePr>
   </w:style>
-  <w:style w:type="table" w:styleId="904">
+  <w:style w:type="table" w:styleId="906">
     <w:name w:val="Grid Table 5 Dark - Accent 3"/>
-    <w:basedOn w:val="865"/>
+    <w:basedOn w:val="867"/>
     <w:uiPriority w:val="99"/>
     <w:pPr>
       <w:pBdr/>
@@ -11973,9 +12012,9 @@
       </w:tcPr>
     </w:tblStylePr>
   </w:style>
-  <w:style w:type="table" w:styleId="905">
+  <w:style w:type="table" w:styleId="907">
     <w:name w:val="Grid Table 5 Dark- Accent 4"/>
-    <w:basedOn w:val="865"/>
+    <w:basedOn w:val="867"/>
     <w:uiPriority w:val="99"/>
     <w:pPr>
       <w:pBdr/>
@@ -12191,9 +12230,9 @@
       </w:tcPr>
     </w:tblStylePr>
   </w:style>
-  <w:style w:type="table" w:styleId="906">
+  <w:style w:type="table" w:styleId="908">
     <w:name w:val="Grid Table 5 Dark - Accent 5"/>
-    <w:basedOn w:val="865"/>
+    <w:basedOn w:val="867"/>
     <w:uiPriority w:val="99"/>
     <w:pPr>
       <w:pBdr/>
@@ -12409,9 +12448,9 @@
       </w:tcPr>
     </w:tblStylePr>
   </w:style>
-  <w:style w:type="table" w:styleId="907">
+  <w:style w:type="table" w:styleId="909">
     <w:name w:val="Grid Table 5 Dark - Accent 6"/>
-    <w:basedOn w:val="865"/>
+    <w:basedOn w:val="867"/>
     <w:uiPriority w:val="99"/>
     <w:pPr>
       <w:pBdr/>
@@ -12627,9 +12666,9 @@
       </w:tcPr>
     </w:tblStylePr>
   </w:style>
-  <w:style w:type="table" w:styleId="908">
+  <w:style w:type="table" w:styleId="910">
     <w:name w:val="Grid Table 6 Colorful"/>
-    <w:basedOn w:val="865"/>
+    <w:basedOn w:val="867"/>
     <w:uiPriority w:val="99"/>
     <w:pPr>
       <w:pBdr/>
@@ -12853,9 +12892,9 @@
       </w:tcPr>
     </w:tblStylePr>
   </w:style>
-  <w:style w:type="table" w:styleId="909">
+  <w:style w:type="table" w:styleId="911">
     <w:name w:val="Grid Table 6 Colorful - Accent 1"/>
-    <w:basedOn w:val="865"/>
+    <w:basedOn w:val="867"/>
     <w:uiPriority w:val="99"/>
     <w:pPr>
       <w:pBdr/>
@@ -13079,9 +13118,9 @@
       </w:tcPr>
     </w:tblStylePr>
   </w:style>
-  <w:style w:type="table" w:styleId="910">
+  <w:style w:type="table" w:styleId="912">
     <w:name w:val="Grid Table 6 Colorful - Accent 2"/>
-    <w:basedOn w:val="865"/>
+    <w:basedOn w:val="867"/>
     <w:uiPriority w:val="99"/>
     <w:pPr>
       <w:pBdr/>
@@ -13305,9 +13344,9 @@
       </w:tcPr>
     </w:tblStylePr>
   </w:style>
-  <w:style w:type="table" w:styleId="911">
+  <w:style w:type="table" w:styleId="913">
     <w:name w:val="Grid Table 6 Colorful - Accent 3"/>
-    <w:basedOn w:val="865"/>
+    <w:basedOn w:val="867"/>
     <w:uiPriority w:val="99"/>
     <w:pPr>
       <w:pBdr/>
@@ -13531,9 +13570,9 @@
       </w:tcPr>
     </w:tblStylePr>
   </w:style>
-  <w:style w:type="table" w:styleId="912">
+  <w:style w:type="table" w:styleId="914">
     <w:name w:val="Grid Table 6 Colorful - Accent 4"/>
-    <w:basedOn w:val="865"/>
+    <w:basedOn w:val="867"/>
     <w:uiPriority w:val="99"/>
     <w:pPr>
       <w:pBdr/>
@@ -13757,9 +13796,9 @@
       </w:tcPr>
     </w:tblStylePr>
   </w:style>
-  <w:style w:type="table" w:styleId="913">
+  <w:style w:type="table" w:styleId="915">
     <w:name w:val="Grid Table 6 Colorful - Accent 5"/>
-    <w:basedOn w:val="865"/>
+    <w:basedOn w:val="867"/>
     <w:uiPriority w:val="99"/>
     <w:pPr>
       <w:pBdr/>
@@ -13983,9 +14022,9 @@
       </w:tcPr>
     </w:tblStylePr>
   </w:style>
-  <w:style w:type="table" w:styleId="914">
+  <w:style w:type="table" w:styleId="916">
     <w:name w:val="Grid Table 6 Colorful - Accent 6"/>
-    <w:basedOn w:val="865"/>
+    <w:basedOn w:val="867"/>
     <w:uiPriority w:val="99"/>
     <w:pPr>
       <w:pBdr/>
@@ -14209,9 +14248,9 @@
       </w:tcPr>
     </w:tblStylePr>
   </w:style>
-  <w:style w:type="table" w:styleId="915">
+  <w:style w:type="table" w:styleId="917">
     <w:name w:val="Grid Table 7 Colorful"/>
-    <w:basedOn w:val="865"/>
+    <w:basedOn w:val="867"/>
     <w:uiPriority w:val="99"/>
     <w:pPr>
       <w:pBdr/>
@@ -14456,9 +14495,9 @@
       </w:tcPr>
     </w:tblStylePr>
   </w:style>
-  <w:style w:type="table" w:styleId="916">
+  <w:style w:type="table" w:styleId="918">
     <w:name w:val="Grid Table 7 Colorful - Accent 1"/>
-    <w:basedOn w:val="865"/>
+    <w:basedOn w:val="867"/>
     <w:uiPriority w:val="99"/>
     <w:pPr>
       <w:pBdr/>
@@ -14703,9 +14742,9 @@
       </w:tcPr>
     </w:tblStylePr>
   </w:style>
-  <w:style w:type="table" w:styleId="917">
+  <w:style w:type="table" w:styleId="919">
     <w:name w:val="Grid Table 7 Colorful - Accent 2"/>
-    <w:basedOn w:val="865"/>
+    <w:basedOn w:val="867"/>
     <w:uiPriority w:val="99"/>
     <w:pPr>
       <w:pBdr/>
@@ -14950,9 +14989,9 @@
       </w:tcPr>
     </w:tblStylePr>
   </w:style>
-  <w:style w:type="table" w:styleId="918">
+  <w:style w:type="table" w:styleId="920">
     <w:name w:val="Grid Table 7 Colorful - Accent 3"/>
-    <w:basedOn w:val="865"/>
+    <w:basedOn w:val="867"/>
     <w:uiPriority w:val="99"/>
     <w:pPr>
       <w:pBdr/>
@@ -15197,9 +15236,9 @@
       </w:tcPr>
     </w:tblStylePr>
   </w:style>
-  <w:style w:type="table" w:styleId="919">
+  <w:style w:type="table" w:styleId="921">
     <w:name w:val="Grid Table 7 Colorful - Accent 4"/>
-    <w:basedOn w:val="865"/>
+    <w:basedOn w:val="867"/>
     <w:uiPriority w:val="99"/>
     <w:pPr>
       <w:pBdr/>
@@ -15444,9 +15483,9 @@
       </w:tcPr>
     </w:tblStylePr>
   </w:style>
-  <w:style w:type="table" w:styleId="920">
+  <w:style w:type="table" w:styleId="922">
     <w:name w:val="Grid Table 7 Colorful - Accent 5"/>
-    <w:basedOn w:val="865"/>
+    <w:basedOn w:val="867"/>
     <w:uiPriority w:val="99"/>
     <w:pPr>
       <w:pBdr/>
@@ -15691,9 +15730,9 @@
       </w:tcPr>
     </w:tblStylePr>
   </w:style>
-  <w:style w:type="table" w:styleId="921">
+  <w:style w:type="table" w:styleId="923">
     <w:name w:val="Grid Table 7 Colorful - Accent 6"/>
-    <w:basedOn w:val="865"/>
+    <w:basedOn w:val="867"/>
     <w:uiPriority w:val="99"/>
     <w:pPr>
       <w:pBdr/>
@@ -15938,9 +15977,9 @@
       </w:tcPr>
     </w:tblStylePr>
   </w:style>
-  <w:style w:type="table" w:styleId="922">
+  <w:style w:type="table" w:styleId="924">
     <w:name w:val="List Table 1 Light"/>
-    <w:basedOn w:val="865"/>
+    <w:basedOn w:val="867"/>
     <w:uiPriority w:val="99"/>
     <w:pPr>
       <w:pBdr/>
@@ -16149,9 +16188,9 @@
       </w:tcPr>
     </w:tblStylePr>
   </w:style>
-  <w:style w:type="table" w:styleId="923">
+  <w:style w:type="table" w:styleId="925">
     <w:name w:val="List Table 1 Light - Accent 1"/>
-    <w:basedOn w:val="865"/>
+    <w:basedOn w:val="867"/>
     <w:uiPriority w:val="99"/>
     <w:pPr>
       <w:pBdr/>
@@ -16360,9 +16399,9 @@
       </w:tcPr>
     </w:tblStylePr>
   </w:style>
-  <w:style w:type="table" w:styleId="924">
+  <w:style w:type="table" w:styleId="926">
     <w:name w:val="List Table 1 Light - Accent 2"/>
-    <w:basedOn w:val="865"/>
+    <w:basedOn w:val="867"/>
     <w:uiPriority w:val="99"/>
     <w:pPr>
       <w:pBdr/>
@@ -16571,9 +16610,9 @@
       </w:tcPr>
     </w:tblStylePr>
   </w:style>
-  <w:style w:type="table" w:styleId="925">
+  <w:style w:type="table" w:styleId="927">
     <w:name w:val="List Table 1 Light - Accent 3"/>
-    <w:basedOn w:val="865"/>
+    <w:basedOn w:val="867"/>
     <w:uiPriority w:val="99"/>
     <w:pPr>
       <w:pBdr/>
@@ -16782,9 +16821,9 @@
       </w:tcPr>
     </w:tblStylePr>
   </w:style>
-  <w:style w:type="table" w:styleId="926">
+  <w:style w:type="table" w:styleId="928">
     <w:name w:val="List Table 1 Light - Accent 4"/>
-    <w:basedOn w:val="865"/>
+    <w:basedOn w:val="867"/>
     <w:uiPriority w:val="99"/>
     <w:pPr>
       <w:pBdr/>
@@ -16993,9 +17032,9 @@
       </w:tcPr>
     </w:tblStylePr>
   </w:style>
-  <w:style w:type="table" w:styleId="927">
+  <w:style w:type="table" w:styleId="929">
     <w:name w:val="List Table 1 Light - Accent 5"/>
-    <w:basedOn w:val="865"/>
+    <w:basedOn w:val="867"/>
     <w:uiPriority w:val="99"/>
     <w:pPr>
       <w:pBdr/>
@@ -17204,9 +17243,9 @@
       </w:tcPr>
     </w:tblStylePr>
   </w:style>
-  <w:style w:type="table" w:styleId="928">
+  <w:style w:type="table" w:styleId="930">
     <w:name w:val="List Table 1 Light - Accent 6"/>
-    <w:basedOn w:val="865"/>
+    <w:basedOn w:val="867"/>
     <w:uiPriority w:val="99"/>
     <w:pPr>
       <w:pBdr/>
@@ -17415,9 +17454,9 @@
       </w:tcPr>
     </w:tblStylePr>
   </w:style>
-  <w:style w:type="table" w:styleId="929">
+  <w:style w:type="table" w:styleId="931">
     <w:name w:val="List Table 2"/>
-    <w:basedOn w:val="865"/>
+    <w:basedOn w:val="867"/>
     <w:uiPriority w:val="99"/>
     <w:pPr>
       <w:pBdr/>
@@ -17640,9 +17679,9 @@
       </w:tcPr>
     </w:tblStylePr>
   </w:style>
-  <w:style w:type="table" w:styleId="930">
+  <w:style w:type="table" w:styleId="932">
     <w:name w:val="List Table 2 - Accent 1"/>
-    <w:basedOn w:val="865"/>
+    <w:basedOn w:val="867"/>
     <w:uiPriority w:val="99"/>
     <w:pPr>
       <w:pBdr/>
@@ -17865,9 +17904,9 @@
       </w:tcPr>
     </w:tblStylePr>
   </w:style>
-  <w:style w:type="table" w:styleId="931">
+  <w:style w:type="table" w:styleId="933">
     <w:name w:val="List Table 2 - Accent 2"/>
-    <w:basedOn w:val="865"/>
+    <w:basedOn w:val="867"/>
     <w:uiPriority w:val="99"/>
     <w:pPr>
       <w:pBdr/>
@@ -18090,9 +18129,9 @@
       </w:tcPr>
     </w:tblStylePr>
   </w:style>
-  <w:style w:type="table" w:styleId="932">
+  <w:style w:type="table" w:styleId="934">
     <w:name w:val="List Table 2 - Accent 3"/>
-    <w:basedOn w:val="865"/>
+    <w:basedOn w:val="867"/>
     <w:uiPriority w:val="99"/>
     <w:pPr>
       <w:pBdr/>
@@ -18315,9 +18354,9 @@
       </w:tcPr>
     </w:tblStylePr>
   </w:style>
-  <w:style w:type="table" w:styleId="933">
+  <w:style w:type="table" w:styleId="935">
     <w:name w:val="List Table 2 - Accent 4"/>
-    <w:basedOn w:val="865"/>
+    <w:basedOn w:val="867"/>
     <w:uiPriority w:val="99"/>
     <w:pPr>
       <w:pBdr/>
@@ -18540,9 +18579,9 @@
       </w:tcPr>
     </w:tblStylePr>
   </w:style>
-  <w:style w:type="table" w:styleId="934">
+  <w:style w:type="table" w:styleId="936">
     <w:name w:val="List Table 2 - Accent 5"/>
-    <w:basedOn w:val="865"/>
+    <w:basedOn w:val="867"/>
     <w:uiPriority w:val="99"/>
     <w:pPr>
       <w:pBdr/>
@@ -18765,9 +18804,9 @@
       </w:tcPr>
     </w:tblStylePr>
   </w:style>
-  <w:style w:type="table" w:styleId="935">
+  <w:style w:type="table" w:styleId="937">
     <w:name w:val="List Table 2 - Accent 6"/>
-    <w:basedOn w:val="865"/>
+    <w:basedOn w:val="867"/>
     <w:uiPriority w:val="99"/>
     <w:pPr>
       <w:pBdr/>
@@ -18990,9 +19029,9 @@
       </w:tcPr>
     </w:tblStylePr>
   </w:style>
-  <w:style w:type="table" w:styleId="936">
+  <w:style w:type="table" w:styleId="938">
     <w:name w:val="List Table 3"/>
-    <w:basedOn w:val="865"/>
+    <w:basedOn w:val="867"/>
     <w:uiPriority w:val="99"/>
     <w:pPr>
       <w:pBdr/>
@@ -19208,9 +19247,9 @@
       </w:tcPr>
     </w:tblStylePr>
   </w:style>
-  <w:style w:type="table" w:styleId="937">
+  <w:style w:type="table" w:styleId="939">
     <w:name w:val="List Table 3 - Accent 1"/>
-    <w:basedOn w:val="865"/>
+    <w:basedOn w:val="867"/>
     <w:uiPriority w:val="99"/>
     <w:pPr>
       <w:pBdr/>
@@ -19426,9 +19465,9 @@
       </w:tcPr>
     </w:tblStylePr>
   </w:style>
-  <w:style w:type="table" w:styleId="938">
+  <w:style w:type="table" w:styleId="940">
     <w:name w:val="List Table 3 - Accent 2"/>
-    <w:basedOn w:val="865"/>
+    <w:basedOn w:val="867"/>
     <w:uiPriority w:val="99"/>
     <w:pPr>
       <w:pBdr/>
@@ -19644,9 +19683,9 @@
       </w:tcPr>
     </w:tblStylePr>
   </w:style>
-  <w:style w:type="table" w:styleId="939">
+  <w:style w:type="table" w:styleId="941">
     <w:name w:val="List Table 3 - Accent 3"/>
-    <w:basedOn w:val="865"/>
+    <w:basedOn w:val="867"/>
     <w:uiPriority w:val="99"/>
     <w:pPr>
       <w:pBdr/>
@@ -19862,9 +19901,9 @@
       </w:tcPr>
     </w:tblStylePr>
   </w:style>
-  <w:style w:type="table" w:styleId="940">
+  <w:style w:type="table" w:styleId="942">
     <w:name w:val="List Table 3 - Accent 4"/>
-    <w:basedOn w:val="865"/>
+    <w:basedOn w:val="867"/>
     <w:uiPriority w:val="99"/>
     <w:pPr>
       <w:pBdr/>
@@ -20080,9 +20119,9 @@
       </w:tcPr>
     </w:tblStylePr>
   </w:style>
-  <w:style w:type="table" w:styleId="941">
+  <w:style w:type="table" w:styleId="943">
     <w:name w:val="List Table 3 - Accent 5"/>
-    <w:basedOn w:val="865"/>
+    <w:basedOn w:val="867"/>
     <w:uiPriority w:val="99"/>
     <w:pPr>
       <w:pBdr/>
@@ -20298,9 +20337,9 @@
       </w:tcPr>
     </w:tblStylePr>
   </w:style>
-  <w:style w:type="table" w:styleId="942">
+  <w:style w:type="table" w:styleId="944">
     <w:name w:val="List Table 3 - Accent 6"/>
-    <w:basedOn w:val="865"/>
+    <w:basedOn w:val="867"/>
     <w:uiPriority w:val="99"/>
     <w:pPr>
       <w:pBdr/>
@@ -20516,9 +20555,9 @@
       </w:tcPr>
     </w:tblStylePr>
   </w:style>
-  <w:style w:type="table" w:styleId="943">
+  <w:style w:type="table" w:styleId="945">
     <w:name w:val="List Table 4"/>
-    <w:basedOn w:val="865"/>
+    <w:basedOn w:val="867"/>
     <w:uiPriority w:val="99"/>
     <w:pPr>
       <w:pBdr/>
@@ -20731,9 +20770,9 @@
       </w:tcPr>
     </w:tblStylePr>
   </w:style>
-  <w:style w:type="table" w:styleId="944">
+  <w:style w:type="table" w:styleId="946">
     <w:name w:val="List Table 4 - Accent 1"/>
-    <w:basedOn w:val="865"/>
+    <w:basedOn w:val="867"/>
     <w:uiPriority w:val="99"/>
     <w:pPr>
       <w:pBdr/>
@@ -20946,9 +20985,9 @@
       </w:tcPr>
     </w:tblStylePr>
   </w:style>
-  <w:style w:type="table" w:styleId="945">
+  <w:style w:type="table" w:styleId="947">
     <w:name w:val="List Table 4 - Accent 2"/>
-    <w:basedOn w:val="865"/>
+    <w:basedOn w:val="867"/>
     <w:uiPriority w:val="99"/>
     <w:pPr>
       <w:pBdr/>
@@ -21161,9 +21200,9 @@
       </w:tcPr>
     </w:tblStylePr>
   </w:style>
-  <w:style w:type="table" w:styleId="946">
+  <w:style w:type="table" w:styleId="948">
     <w:name w:val="List Table 4 - Accent 3"/>
-    <w:basedOn w:val="865"/>
+    <w:basedOn w:val="867"/>
     <w:uiPriority w:val="99"/>
     <w:pPr>
       <w:pBdr/>
@@ -21376,9 +21415,9 @@
       </w:tcPr>
     </w:tblStylePr>
   </w:style>
-  <w:style w:type="table" w:styleId="947">
+  <w:style w:type="table" w:styleId="949">
     <w:name w:val="List Table 4 - Accent 4"/>
-    <w:basedOn w:val="865"/>
+    <w:basedOn w:val="867"/>
     <w:uiPriority w:val="99"/>
     <w:pPr>
       <w:pBdr/>
@@ -21591,9 +21630,9 @@
       </w:tcPr>
     </w:tblStylePr>
   </w:style>
-  <w:style w:type="table" w:styleId="948">
+  <w:style w:type="table" w:styleId="950">
     <w:name w:val="List Table 4 - Accent 5"/>
-    <w:basedOn w:val="865"/>
+    <w:basedOn w:val="867"/>
     <w:uiPriority w:val="99"/>
     <w:pPr>
       <w:pBdr/>
@@ -21806,9 +21845,9 @@
       </w:tcPr>
     </w:tblStylePr>
   </w:style>
-  <w:style w:type="table" w:styleId="949">
+  <w:style w:type="table" w:styleId="951">
     <w:name w:val="List Table 4 - Accent 6"/>
-    <w:basedOn w:val="865"/>
+    <w:basedOn w:val="867"/>
     <w:uiPriority w:val="99"/>
     <w:pPr>
       <w:pBdr/>
@@ -22021,9 +22060,9 @@
       </w:tcPr>
     </w:tblStylePr>
   </w:style>
-  <w:style w:type="table" w:styleId="950">
+  <w:style w:type="table" w:styleId="952">
     <w:name w:val="List Table 5 Dark"/>
-    <w:basedOn w:val="865"/>
+    <w:basedOn w:val="867"/>
     <w:uiPriority w:val="99"/>
     <w:pPr>
       <w:pBdr/>
@@ -22257,9 +22296,9 @@
       </w:tcPr>
     </w:tblStylePr>
   </w:style>
-  <w:style w:type="table" w:styleId="951">
+  <w:style w:type="table" w:styleId="953">
     <w:name w:val="List Table 5 Dark - Accent 1"/>
-    <w:basedOn w:val="865"/>
+    <w:basedOn w:val="867"/>
     <w:uiPriority w:val="99"/>
     <w:pPr>
       <w:pBdr/>
@@ -22493,9 +22532,9 @@
       </w:tcPr>
     </w:tblStylePr>
   </w:style>
-  <w:style w:type="table" w:styleId="952">
+  <w:style w:type="table" w:styleId="954">
     <w:name w:val="List Table 5 Dark - Accent 2"/>
-    <w:basedOn w:val="865"/>
+    <w:basedOn w:val="867"/>
     <w:uiPriority w:val="99"/>
     <w:pPr>
       <w:pBdr/>
@@ -22729,9 +22768,9 @@
       </w:tcPr>
     </w:tblStylePr>
   </w:style>
-  <w:style w:type="table" w:styleId="953">
+  <w:style w:type="table" w:styleId="955">
     <w:name w:val="List Table 5 Dark - Accent 3"/>
-    <w:basedOn w:val="865"/>
+    <w:basedOn w:val="867"/>
     <w:uiPriority w:val="99"/>
     <w:pPr>
       <w:pBdr/>
@@ -22965,9 +23004,9 @@
       </w:tcPr>
     </w:tblStylePr>
   </w:style>
-  <w:style w:type="table" w:styleId="954">
+  <w:style w:type="table" w:styleId="956">
     <w:name w:val="List Table 5 Dark - Accent 4"/>
-    <w:basedOn w:val="865"/>
+    <w:basedOn w:val="867"/>
     <w:uiPriority w:val="99"/>
     <w:pPr>
       <w:pBdr/>
@@ -23201,9 +23240,9 @@
       </w:tcPr>
     </w:tblStylePr>
   </w:style>
-  <w:style w:type="table" w:styleId="955">
+  <w:style w:type="table" w:styleId="957">
     <w:name w:val="List Table 5 Dark - Accent 5"/>
-    <w:basedOn w:val="865"/>
+    <w:basedOn w:val="867"/>
     <w:uiPriority w:val="99"/>
     <w:pPr>
       <w:pBdr/>
@@ -23437,9 +23476,9 @@
       </w:tcPr>
     </w:tblStylePr>
   </w:style>
-  <w:style w:type="table" w:styleId="956">
+  <w:style w:type="table" w:styleId="958">
     <w:name w:val="List Table 5 Dark - Accent 6"/>
-    <w:basedOn w:val="865"/>
+    <w:basedOn w:val="867"/>
     <w:uiPriority w:val="99"/>
     <w:pPr>
       <w:pBdr/>
@@ -23673,9 +23712,9 @@
       </w:tcPr>
     </w:tblStylePr>
   </w:style>
-  <w:style w:type="table" w:styleId="957">
+  <w:style w:type="table" w:styleId="959">
     <w:name w:val="List Table 6 Colorful"/>
-    <w:basedOn w:val="865"/>
+    <w:basedOn w:val="867"/>
     <w:uiPriority w:val="99"/>
     <w:pPr>
       <w:pBdr/>
@@ -23893,9 +23932,9 @@
       </w:tcPr>
     </w:tblStylePr>
   </w:style>
-  <w:style w:type="table" w:styleId="958">
+  <w:style w:type="table" w:styleId="960">
     <w:name w:val="List Table 6 Colorful - Accent 1"/>
-    <w:basedOn w:val="865"/>
+    <w:basedOn w:val="867"/>
     <w:uiPriority w:val="99"/>
     <w:pPr>
       <w:pBdr/>
@@ -24113,9 +24152,9 @@
       </w:tcPr>
     </w:tblStylePr>
   </w:style>
-  <w:style w:type="table" w:styleId="959">
+  <w:style w:type="table" w:styleId="961">
     <w:name w:val="List Table 6 Colorful - Accent 2"/>
-    <w:basedOn w:val="865"/>
+    <w:basedOn w:val="867"/>
     <w:uiPriority w:val="99"/>
     <w:pPr>
       <w:pBdr/>
@@ -24333,9 +24372,9 @@
       </w:tcPr>
     </w:tblStylePr>
   </w:style>
-  <w:style w:type="table" w:styleId="960">
+  <w:style w:type="table" w:styleId="962">
     <w:name w:val="List Table 6 Colorful - Accent 3"/>
-    <w:basedOn w:val="865"/>
+    <w:basedOn w:val="867"/>
     <w:uiPriority w:val="99"/>
     <w:pPr>
       <w:pBdr/>
@@ -24553,9 +24592,9 @@
       </w:tcPr>
     </w:tblStylePr>
   </w:style>
-  <w:style w:type="table" w:styleId="961">
+  <w:style w:type="table" w:styleId="963">
     <w:name w:val="List Table 6 Colorful - Accent 4"/>
-    <w:basedOn w:val="865"/>
+    <w:basedOn w:val="867"/>
     <w:uiPriority w:val="99"/>
     <w:pPr>
       <w:pBdr/>
@@ -24773,9 +24812,9 @@
       </w:tcPr>
     </w:tblStylePr>
   </w:style>
-  <w:style w:type="table" w:styleId="962">
+  <w:style w:type="table" w:styleId="964">
     <w:name w:val="List Table 6 Colorful - Accent 5"/>
-    <w:basedOn w:val="865"/>
+    <w:basedOn w:val="867"/>
     <w:uiPriority w:val="99"/>
     <w:pPr>
       <w:pBdr/>
@@ -24993,9 +25032,9 @@
       </w:tcPr>
     </w:tblStylePr>
   </w:style>
-  <w:style w:type="table" w:styleId="963">
+  <w:style w:type="table" w:styleId="965">
     <w:name w:val="List Table 6 Colorful - Accent 6"/>
-    <w:basedOn w:val="865"/>
+    <w:basedOn w:val="867"/>
     <w:uiPriority w:val="99"/>
     <w:pPr>
       <w:pBdr/>
@@ -25213,9 +25252,9 @@
       </w:tcPr>
     </w:tblStylePr>
   </w:style>
-  <w:style w:type="table" w:styleId="964">
+  <w:style w:type="table" w:styleId="966">
     <w:name w:val="List Table 7 Colorful"/>
-    <w:basedOn w:val="865"/>
+    <w:basedOn w:val="867"/>
     <w:uiPriority w:val="99"/>
     <w:pPr>
       <w:pBdr/>
@@ -25461,9 +25500,9 @@
       </w:tcPr>
     </w:tblStylePr>
   </w:style>
-  <w:style w:type="table" w:styleId="965">
+  <w:style w:type="table" w:styleId="967">
     <w:name w:val="List Table 7 Colorful - Accent 1"/>
-    <w:basedOn w:val="865"/>
+    <w:basedOn w:val="867"/>
     <w:uiPriority w:val="99"/>
     <w:pPr>
       <w:pBdr/>
@@ -25709,9 +25748,9 @@
       </w:tcPr>
     </w:tblStylePr>
   </w:style>
-  <w:style w:type="table" w:styleId="966">
+  <w:style w:type="table" w:styleId="968">
     <w:name w:val="List Table 7 Colorful - Accent 2"/>
-    <w:basedOn w:val="865"/>
+    <w:basedOn w:val="867"/>
     <w:uiPriority w:val="99"/>
     <w:pPr>
       <w:pBdr/>
@@ -25957,9 +25996,9 @@
       </w:tcPr>
     </w:tblStylePr>
   </w:style>
-  <w:style w:type="table" w:styleId="967">
+  <w:style w:type="table" w:styleId="969">
     <w:name w:val="List Table 7 Colorful - Accent 3"/>
-    <w:basedOn w:val="865"/>
+    <w:basedOn w:val="867"/>
     <w:uiPriority w:val="99"/>
     <w:pPr>
       <w:pBdr/>
@@ -26205,9 +26244,9 @@
       </w:tcPr>
     </w:tblStylePr>
   </w:style>
-  <w:style w:type="table" w:styleId="968">
+  <w:style w:type="table" w:styleId="970">
     <w:name w:val="List Table 7 Colorful - Accent 4"/>
-    <w:basedOn w:val="865"/>
+    <w:basedOn w:val="867"/>
     <w:uiPriority w:val="99"/>
     <w:pPr>
       <w:pBdr/>
@@ -26453,9 +26492,9 @@
       </w:tcPr>
     </w:tblStylePr>
   </w:style>
-  <w:style w:type="table" w:styleId="969">
+  <w:style w:type="table" w:styleId="971">
     <w:name w:val="List Table 7 Colorful - Accent 5"/>
-    <w:basedOn w:val="865"/>
+    <w:basedOn w:val="867"/>
     <w:uiPriority w:val="99"/>
     <w:pPr>
       <w:pBdr/>
@@ -26701,9 +26740,9 @@
       </w:tcPr>
     </w:tblStylePr>
   </w:style>
-  <w:style w:type="table" w:styleId="970">
+  <w:style w:type="table" w:styleId="972">
     <w:name w:val="List Table 7 Colorful - Accent 6"/>
-    <w:basedOn w:val="865"/>
+    <w:basedOn w:val="867"/>
     <w:uiPriority w:val="99"/>
     <w:pPr>
       <w:pBdr/>
@@ -26949,9 +26988,9 @@
       </w:tcPr>
     </w:tblStylePr>
   </w:style>
-  <w:style w:type="table" w:styleId="971">
+  <w:style w:type="table" w:styleId="973">
     <w:name w:val="Lined - Accent"/>
-    <w:basedOn w:val="865"/>
+    <w:basedOn w:val="867"/>
     <w:uiPriority w:val="99"/>
     <w:pPr>
       <w:pBdr/>
@@ -27166,9 +27205,9 @@
       </w:tcPr>
     </w:tblStylePr>
   </w:style>
-  <w:style w:type="table" w:styleId="972">
+  <w:style w:type="table" w:styleId="974">
     <w:name w:val="Lined - Accent 1"/>
-    <w:basedOn w:val="865"/>
+    <w:basedOn w:val="867"/>
     <w:uiPriority w:val="99"/>
     <w:pPr>
       <w:pBdr/>
@@ -27383,9 +27422,9 @@
       </w:tcPr>
     </w:tblStylePr>
   </w:style>
-  <w:style w:type="table" w:styleId="973">
+  <w:style w:type="table" w:styleId="975">
     <w:name w:val="Lined - Accent 2"/>
-    <w:basedOn w:val="865"/>
+    <w:basedOn w:val="867"/>
     <w:uiPriority w:val="99"/>
     <w:pPr>
       <w:pBdr/>
@@ -27600,9 +27639,9 @@
       </w:tcPr>
     </w:tblStylePr>
   </w:style>
-  <w:style w:type="table" w:styleId="974">
+  <w:style w:type="table" w:styleId="976">
     <w:name w:val="Lined - Accent 3"/>
-    <w:basedOn w:val="865"/>
+    <w:basedOn w:val="867"/>
     <w:uiPriority w:val="99"/>
     <w:pPr>
       <w:pBdr/>
@@ -27817,9 +27856,9 @@
       </w:tcPr>
     </w:tblStylePr>
   </w:style>
-  <w:style w:type="table" w:styleId="975">
+  <w:style w:type="table" w:styleId="977">
     <w:name w:val="Lined - Accent 4"/>
-    <w:basedOn w:val="865"/>
+    <w:basedOn w:val="867"/>
     <w:uiPriority w:val="99"/>
     <w:pPr>
       <w:pBdr/>
@@ -28034,9 +28073,9 @@
       </w:tcPr>
     </w:tblStylePr>
   </w:style>
-  <w:style w:type="table" w:styleId="976">
+  <w:style w:type="table" w:styleId="978">
     <w:name w:val="Lined - Accent 5"/>
-    <w:basedOn w:val="865"/>
+    <w:basedOn w:val="867"/>
     <w:uiPriority w:val="99"/>
     <w:pPr>
       <w:pBdr/>
@@ -28251,9 +28290,9 @@
       </w:tcPr>
     </w:tblStylePr>
   </w:style>
-  <w:style w:type="table" w:styleId="977">
+  <w:style w:type="table" w:styleId="979">
     <w:name w:val="Lined - Accent 6"/>
-    <w:basedOn w:val="865"/>
+    <w:basedOn w:val="867"/>
     <w:uiPriority w:val="99"/>
     <w:pPr>
       <w:pBdr/>
@@ -28468,9 +28507,9 @@
       </w:tcPr>
     </w:tblStylePr>
   </w:style>
-  <w:style w:type="table" w:styleId="978">
+  <w:style w:type="table" w:styleId="980">
     <w:name w:val="Bordered &amp; Lined - Accent"/>
-    <w:basedOn w:val="865"/>
+    <w:basedOn w:val="867"/>
     <w:uiPriority w:val="99"/>
     <w:pPr>
       <w:pBdr/>
@@ -28692,9 +28731,9 @@
       </w:tcPr>
     </w:tblStylePr>
   </w:style>
-  <w:style w:type="table" w:styleId="979">
+  <w:style w:type="table" w:styleId="981">
     <w:name w:val="Bordered &amp; Lined - Accent 1"/>
-    <w:basedOn w:val="865"/>
+    <w:basedOn w:val="867"/>
     <w:uiPriority w:val="99"/>
     <w:pPr>
       <w:pBdr/>
@@ -28916,9 +28955,9 @@
       </w:tcPr>
     </w:tblStylePr>
   </w:style>
-  <w:style w:type="table" w:styleId="980">
+  <w:style w:type="table" w:styleId="982">
     <w:name w:val="Bordered &amp; Lined - Accent 2"/>
-    <w:basedOn w:val="865"/>
+    <w:basedOn w:val="867"/>
     <w:uiPriority w:val="99"/>
     <w:pPr>
       <w:pBdr/>
@@ -29140,9 +29179,9 @@
       </w:tcPr>
     </w:tblStylePr>
   </w:style>
-  <w:style w:type="table" w:styleId="981">
+  <w:style w:type="table" w:styleId="983">
     <w:name w:val="Bordered &amp; Lined - Accent 3"/>
-    <w:basedOn w:val="865"/>
+    <w:basedOn w:val="867"/>
     <w:uiPriority w:val="99"/>
     <w:pPr>
       <w:pBdr/>
@@ -29364,9 +29403,9 @@
       </w:tcPr>
     </w:tblStylePr>
   </w:style>
-  <w:style w:type="table" w:styleId="982">
+  <w:style w:type="table" w:styleId="984">
     <w:name w:val="Bordered &amp; Lined - Accent 4"/>
-    <w:basedOn w:val="865"/>
+    <w:basedOn w:val="867"/>
     <w:uiPriority w:val="99"/>
     <w:pPr>
       <w:pBdr/>
@@ -29588,9 +29627,9 @@
       </w:tcPr>
     </w:tblStylePr>
   </w:style>
-  <w:style w:type="table" w:styleId="983">
+  <w:style w:type="table" w:styleId="985">
     <w:name w:val="Bordered &amp; Lined - Accent 5"/>
-    <w:basedOn w:val="865"/>
+    <w:basedOn w:val="867"/>
     <w:uiPriority w:val="99"/>
     <w:pPr>
       <w:pBdr/>
@@ -29812,9 +29851,9 @@
       </w:tcPr>
     </w:tblStylePr>
   </w:style>
-  <w:style w:type="table" w:styleId="984">
+  <w:style w:type="table" w:styleId="986">
     <w:name w:val="Bordered &amp; Lined - Accent 6"/>
-    <w:basedOn w:val="865"/>
+    <w:basedOn w:val="867"/>
     <w:uiPriority w:val="99"/>
     <w:pPr>
       <w:pBdr/>
@@ -30036,9 +30075,9 @@
       </w:tcPr>
     </w:tblStylePr>
   </w:style>
-  <w:style w:type="table" w:styleId="985">
+  <w:style w:type="table" w:styleId="987">
     <w:name w:val="Bordered"/>
-    <w:basedOn w:val="865"/>
+    <w:basedOn w:val="867"/>
     <w:uiPriority w:val="99"/>
     <w:pPr>
       <w:pBdr/>
@@ -30256,9 +30295,9 @@
       </w:tcPr>
     </w:tblStylePr>
   </w:style>
-  <w:style w:type="table" w:styleId="986">
+  <w:style w:type="table" w:styleId="988">
     <w:name w:val="Bordered - Accent 1"/>
-    <w:basedOn w:val="865"/>
+    <w:basedOn w:val="867"/>
     <w:uiPriority w:val="99"/>
     <w:pPr>
       <w:pBdr/>
@@ -30476,9 +30515,9 @@
       </w:tcPr>
     </w:tblStylePr>
   </w:style>
-  <w:style w:type="table" w:styleId="987">
+  <w:style w:type="table" w:styleId="989">
     <w:name w:val="Bordered - Accent 2"/>
-    <w:basedOn w:val="865"/>
+    <w:basedOn w:val="867"/>
     <w:uiPriority w:val="99"/>
     <w:pPr>
       <w:pBdr/>
@@ -30696,9 +30735,9 @@
       </w:tcPr>
     </w:tblStylePr>
   </w:style>
-  <w:style w:type="table" w:styleId="988">
+  <w:style w:type="table" w:styleId="990">
     <w:name w:val="Bordered - Accent 3"/>
-    <w:basedOn w:val="865"/>
+    <w:basedOn w:val="867"/>
     <w:uiPriority w:val="99"/>
     <w:pPr>
       <w:pBdr/>
@@ -30916,9 +30955,9 @@
       </w:tcPr>
     </w:tblStylePr>
   </w:style>
-  <w:style w:type="table" w:styleId="989">
+  <w:style w:type="table" w:styleId="991">
     <w:name w:val="Bordered - Accent 4"/>
-    <w:basedOn w:val="865"/>
+    <w:basedOn w:val="867"/>
     <w:uiPriority w:val="99"/>
     <w:pPr>
       <w:pBdr/>
@@ -31136,9 +31175,9 @@
       </w:tcPr>
     </w:tblStylePr>
   </w:style>
-  <w:style w:type="table" w:styleId="990">
+  <w:style w:type="table" w:styleId="992">
     <w:name w:val="Bordered - Accent 5"/>
-    <w:basedOn w:val="865"/>
+    <w:basedOn w:val="867"/>
     <w:uiPriority w:val="99"/>
     <w:pPr>
       <w:pBdr/>
@@ -31356,9 +31395,9 @@
       </w:tcPr>
     </w:tblStylePr>
   </w:style>
-  <w:style w:type="table" w:styleId="991">
+  <w:style w:type="table" w:styleId="993">
     <w:name w:val="Bordered - Accent 6"/>
-    <w:basedOn w:val="865"/>
+    <w:basedOn w:val="867"/>
     <w:uiPriority w:val="99"/>
     <w:pPr>
       <w:pBdr/>
@@ -31576,7 +31615,7 @@
       </w:tcPr>
     </w:tblStylePr>
   </w:style>
-  <w:style w:type="table" w:styleId="992">
+  <w:style w:type="table" w:styleId="994">
     <w:name w:val="TableNormal"/>
     <w:pPr>
       <w:pBdr/>

</xml_diff>